<commit_message>
SG2: Update All Artefacts
</commit_message>
<xml_diff>
--- a/SG2_Units/SG2_Artefacts/SG2_Design.docx
+++ b/SG2_Units/SG2_Artefacts/SG2_Design.docx
@@ -419,10 +419,14 @@
             <w:tcW w:w="2304" w:type="dxa"/>
             <w:tcMar/>
           </w:tcPr>
-          <w:p wp14:textId="1D47655E">
+          <w:p wp14:textId="387623F1">
             <w:pPr>
               <w:pStyle w:val="Tabletext"/>
             </w:pPr>
+            <w:r>
+              <w:rPr/>
+              <w:t>15/Mar/26</w:t>
+            </w:r>
           </w:p>
         </w:tc>
         <w:tc>
@@ -430,10 +434,14 @@
             <w:tcW w:w="1152" w:type="dxa"/>
             <w:tcMar/>
           </w:tcPr>
-          <w:p wp14:textId="05C51415">
+          <w:p wp14:textId="4637EED5">
             <w:pPr>
               <w:pStyle w:val="Tabletext"/>
             </w:pPr>
+            <w:r>
+              <w:rPr/>
+              <w:t>1.2</w:t>
+            </w:r>
           </w:p>
         </w:tc>
         <w:tc>
@@ -441,10 +449,52 @@
             <w:tcW w:w="3744" w:type="dxa"/>
             <w:tcMar/>
           </w:tcPr>
-          <w:p wp14:textId="77777777">
+          <w:p wp14:textId="76E44B8E">
             <w:pPr>
               <w:pStyle w:val="Tabletext"/>
+              <w:rPr>
+                <w:noProof w:val="0"/>
+                <w:lang w:val="en-US"/>
+              </w:rPr>
             </w:pPr>
+            <w:r>
+              <w:rPr>
+                <w:noProof w:val="0"/>
+                <w:lang w:val="en-US"/>
+              </w:rPr>
+              <w:t xml:space="preserve">Updated D3 – D4 </w:t>
+            </w:r>
+            <w:r>
+              <w:br/>
+            </w:r>
+            <w:r>
+              <w:rPr>
+                <w:noProof w:val="0"/>
+                <w:lang w:val="en-US"/>
+              </w:rPr>
+              <w:t xml:space="preserve">Add Mobile </w:t>
+            </w:r>
+            <w:r>
+              <w:rPr>
+                <w:noProof w:val="0"/>
+                <w:lang w:val="en-US"/>
+              </w:rPr>
+              <w:t xml:space="preserve">App </w:t>
+            </w:r>
+            <w:r>
+              <w:rPr>
+                <w:noProof w:val="0"/>
+                <w:lang w:val="en-US"/>
+              </w:rPr>
+              <w:t>Pictures</w:t>
+            </w:r>
+            <w:r>
+              <w:rPr>
+                <w:noProof w:val="0"/>
+                <w:lang w:val="en-US"/>
+              </w:rPr>
+              <w:t xml:space="preserve"> (D5 – D6)</w:t>
+            </w:r>
           </w:p>
         </w:tc>
         <w:tc>
@@ -452,7 +502,20 @@
             <w:tcW w:w="2304" w:type="dxa"/>
             <w:tcMar/>
           </w:tcPr>
-          <w:p wp14:textId="77777777">
+          <w:p wp14:textId="1EC9FE57">
+            <w:pPr>
+              <w:pStyle w:val="Tabletext"/>
+            </w:pPr>
+            <w:r>
+              <w:rPr/>
+              <w:t>Mustafa Al-Bayati</w:t>
+            </w:r>
+            <w:r>
+              <w:rPr/>
+              <w:t xml:space="preserve"> &amp; Daniel Jönsson</w:t>
+            </w:r>
+          </w:p>
+          <w:p wp14:textId="4BC607A0">
             <w:pPr>
               <w:pStyle w:val="Tabletext"/>
             </w:pPr>
@@ -2446,60 +2509,364 @@
     <w:p>
       <w:pPr>
         <w:pStyle w:val="Rubrik3"/>
-        <w:spacing w:before="240" w:beforeAutospacing="off" w:after="60" w:afterAutospacing="off"/>
-      </w:pPr>
-      <w:r>
-        <w:rPr>
-          <w:rFonts w:ascii="Arial" w:hAnsi="Arial" w:eastAsia="Arial" w:cs="Arial"/>
+        <w:rPr>
+          <w:rFonts w:ascii="Times New Roman" w:hAnsi="Times New Roman" w:eastAsia="Times New Roman" w:cs="Times New Roman"/>
           <w:b w:val="1"/>
           <w:bCs w:val="1"/>
           <w:noProof w:val="0"/>
-          <w:sz w:val="26"/>
-          <w:szCs w:val="26"/>
-          <w:lang w:val="en-US"/>
-        </w:rPr>
-        <w:t>D3.</w:t>
-      </w:r>
-      <w:r>
-        <w:rPr>
-          <w:rFonts w:ascii="Arial" w:hAnsi="Arial" w:eastAsia="Arial" w:cs="Arial"/>
+          <w:color w:val="auto"/>
+          <w:sz w:val="36"/>
+          <w:szCs w:val="36"/>
+          <w:lang w:val="sv-SE"/>
+        </w:rPr>
+      </w:pPr>
+      <w:r>
+        <w:rPr>
+          <w:noProof w:val="0"/>
+          <w:lang w:val="sv-SE"/>
+        </w:rPr>
+        <w:t>D3. Web Device Management Interface (Essential)</w:t>
+      </w:r>
+    </w:p>
+    <w:p>
+      <w:pPr>
+        <w:pStyle w:val="Normal"/>
+        <w:rPr>
+          <w:rFonts w:ascii="Times New Roman" w:hAnsi="Times New Roman" w:eastAsia="Times New Roman" w:cs="Times New Roman"/>
           <w:b w:val="1"/>
           <w:bCs w:val="1"/>
           <w:noProof w:val="0"/>
-          <w:sz w:val="26"/>
-          <w:szCs w:val="26"/>
-          <w:lang w:val="en-US"/>
-        </w:rPr>
-        <w:t xml:space="preserve"> Web</w:t>
-      </w:r>
-      <w:r>
-        <w:rPr>
-          <w:rFonts w:ascii="Arial" w:hAnsi="Arial" w:eastAsia="Arial" w:cs="Arial"/>
+          <w:sz w:val="28"/>
+          <w:szCs w:val="28"/>
+          <w:lang w:val="sv-SE"/>
+        </w:rPr>
+      </w:pPr>
+      <w:r>
+        <w:rPr>
           <w:b w:val="1"/>
           <w:bCs w:val="1"/>
           <w:noProof w:val="0"/>
-          <w:sz w:val="26"/>
-          <w:szCs w:val="26"/>
+          <w:lang w:val="sv-SE"/>
+        </w:rPr>
+        <w:t>Description</w:t>
+      </w:r>
+    </w:p>
+    <w:p>
+      <w:pPr>
+        <w:spacing w:before="240" w:beforeAutospacing="off" w:after="240" w:afterAutospacing="off"/>
+        <w:jc w:val="left"/>
+        <w:rPr>
+          <w:rFonts w:ascii="Times New Roman" w:hAnsi="Times New Roman" w:eastAsia="Times New Roman" w:cs="Times New Roman"/>
+          <w:b w:val="0"/>
+          <w:bCs w:val="0"/>
+          <w:noProof w:val="0"/>
+          <w:sz w:val="24"/>
+          <w:szCs w:val="24"/>
           <w:lang w:val="en-US"/>
         </w:rPr>
-        <w:t xml:space="preserve"> </w:t>
-      </w:r>
-      <w:r>
-        <w:rPr>
-          <w:rFonts w:ascii="Arial" w:hAnsi="Arial" w:eastAsia="Arial" w:cs="Arial"/>
+      </w:pPr>
+      <w:r>
+        <w:rPr>
+          <w:rFonts w:ascii="Times New Roman" w:hAnsi="Times New Roman" w:eastAsia="Times New Roman" w:cs="Times New Roman"/>
+          <w:b w:val="0"/>
+          <w:bCs w:val="0"/>
+          <w:noProof w:val="0"/>
+          <w:sz w:val="24"/>
+          <w:szCs w:val="24"/>
+          <w:lang w:val="en-US"/>
+        </w:rPr>
+        <w:t>The Web Device Management Interface provides a centralized overview of all connected smart home devices and sensors.</w:t>
+      </w:r>
+      <w:r>
+        <w:br/>
+      </w:r>
+      <w:r>
+        <w:rPr>
+          <w:rFonts w:ascii="Times New Roman" w:hAnsi="Times New Roman" w:eastAsia="Times New Roman" w:cs="Times New Roman"/>
+          <w:b w:val="0"/>
+          <w:bCs w:val="0"/>
+          <w:noProof w:val="0"/>
+          <w:sz w:val="24"/>
+          <w:szCs w:val="24"/>
+          <w:lang w:val="en-US"/>
+        </w:rPr>
+        <w:t xml:space="preserve"> It allows users to view device status, hardware pin assignments, and connectivity state through a structured card based interface.</w:t>
+      </w:r>
+    </w:p>
+    <w:p>
+      <w:pPr>
+        <w:spacing w:before="240" w:beforeAutospacing="off" w:after="240" w:afterAutospacing="off"/>
+        <w:jc w:val="left"/>
+        <w:rPr>
+          <w:rFonts w:ascii="Times New Roman" w:hAnsi="Times New Roman" w:eastAsia="Times New Roman" w:cs="Times New Roman"/>
+          <w:b w:val="0"/>
+          <w:bCs w:val="0"/>
+          <w:noProof w:val="0"/>
+          <w:sz w:val="24"/>
+          <w:szCs w:val="24"/>
+          <w:lang w:val="sv-SE"/>
+        </w:rPr>
+      </w:pPr>
+      <w:r>
+        <w:rPr>
+          <w:rFonts w:ascii="Times New Roman" w:hAnsi="Times New Roman" w:eastAsia="Times New Roman" w:cs="Times New Roman"/>
+          <w:b w:val="0"/>
+          <w:bCs w:val="0"/>
+          <w:noProof w:val="0"/>
+          <w:sz w:val="24"/>
+          <w:szCs w:val="24"/>
+          <w:lang w:val="sv-SE"/>
+        </w:rPr>
+        <w:t>The page acts as a device inventory and monitoring interface and complements the Hub control panel where actual control actions are performed.</w:t>
+      </w:r>
+    </w:p>
+    <w:p>
+      <w:pPr>
+        <w:pStyle w:val="Rubrik3"/>
+        <w:spacing w:before="281" w:beforeAutospacing="off" w:after="281" w:afterAutospacing="off"/>
+        <w:jc w:val="left"/>
+      </w:pPr>
+      <w:r>
+        <w:rPr>
+          <w:rFonts w:ascii="Times New Roman" w:hAnsi="Times New Roman" w:eastAsia="Times New Roman" w:cs="Times New Roman"/>
           <w:b w:val="1"/>
           <w:bCs w:val="1"/>
           <w:noProof w:val="0"/>
-          <w:sz w:val="26"/>
-          <w:szCs w:val="26"/>
-          <w:lang w:val="en-GB"/>
-        </w:rPr>
-        <w:t>Device Management Interface (Essential)</w:t>
-      </w:r>
-    </w:p>
-    <w:p>
-      <w:pPr>
-        <w:spacing w:before="0" w:beforeAutospacing="off" w:after="0" w:afterAutospacing="off"/>
+          <w:sz w:val="28"/>
+          <w:szCs w:val="28"/>
+          <w:lang w:val="sv-SE"/>
+        </w:rPr>
+        <w:t>Components</w:t>
+      </w:r>
+    </w:p>
+    <w:p>
+      <w:pPr>
+        <w:spacing w:before="240" w:beforeAutospacing="off" w:after="240" w:afterAutospacing="off"/>
+        <w:jc w:val="left"/>
+        <w:rPr>
+          <w:rFonts w:ascii="Times New Roman" w:hAnsi="Times New Roman" w:eastAsia="Times New Roman" w:cs="Times New Roman"/>
+          <w:noProof w:val="0"/>
+          <w:sz w:val="24"/>
+          <w:szCs w:val="24"/>
+          <w:lang w:val="sv-SE"/>
+        </w:rPr>
+      </w:pPr>
+      <w:r>
+        <w:rPr>
+          <w:rFonts w:ascii="Times New Roman" w:hAnsi="Times New Roman" w:eastAsia="Times New Roman" w:cs="Times New Roman"/>
+          <w:noProof w:val="0"/>
+          <w:sz w:val="24"/>
+          <w:szCs w:val="24"/>
+          <w:lang w:val="sv-SE"/>
+        </w:rPr>
+        <w:t>Device cards grid layout</w:t>
+      </w:r>
+    </w:p>
+    <w:p>
+      <w:pPr>
+        <w:spacing w:before="240" w:beforeAutospacing="off" w:after="240" w:afterAutospacing="off"/>
+        <w:jc w:val="left"/>
+      </w:pPr>
+      <w:r>
+        <w:rPr>
+          <w:rFonts w:ascii="Times New Roman" w:hAnsi="Times New Roman" w:eastAsia="Times New Roman" w:cs="Times New Roman"/>
+          <w:noProof w:val="0"/>
+          <w:sz w:val="24"/>
+          <w:szCs w:val="24"/>
+          <w:lang w:val="sv-SE"/>
+        </w:rPr>
+        <w:t>Each device card contains:</w:t>
+      </w:r>
+    </w:p>
+    <w:p>
+      <w:pPr>
+        <w:pStyle w:val="ListParagraph"/>
+        <w:numPr>
+          <w:ilvl w:val="0"/>
+          <w:numId w:val="1"/>
+        </w:numPr>
+        <w:spacing w:before="240" w:beforeAutospacing="off" w:after="240" w:afterAutospacing="off"/>
+        <w:jc w:val="left"/>
+        <w:rPr>
+          <w:rFonts w:ascii="Times New Roman" w:hAnsi="Times New Roman" w:eastAsia="Times New Roman" w:cs="Times New Roman"/>
+          <w:noProof w:val="0"/>
+          <w:sz w:val="24"/>
+          <w:szCs w:val="24"/>
+          <w:lang w:val="sv-SE"/>
+        </w:rPr>
+      </w:pPr>
+      <w:r>
+        <w:rPr>
+          <w:rFonts w:ascii="Times New Roman" w:hAnsi="Times New Roman" w:eastAsia="Times New Roman" w:cs="Times New Roman"/>
+          <w:noProof w:val="0"/>
+          <w:sz w:val="24"/>
+          <w:szCs w:val="24"/>
+          <w:lang w:val="sv-SE"/>
+        </w:rPr>
+        <w:t>Device icon</w:t>
+      </w:r>
+    </w:p>
+    <w:p>
+      <w:pPr>
+        <w:pStyle w:val="ListParagraph"/>
+        <w:numPr>
+          <w:ilvl w:val="0"/>
+          <w:numId w:val="1"/>
+        </w:numPr>
+        <w:spacing w:before="240" w:beforeAutospacing="off" w:after="240" w:afterAutospacing="off"/>
+        <w:jc w:val="left"/>
+        <w:rPr>
+          <w:rFonts w:ascii="Times New Roman" w:hAnsi="Times New Roman" w:eastAsia="Times New Roman" w:cs="Times New Roman"/>
+          <w:noProof w:val="0"/>
+          <w:sz w:val="24"/>
+          <w:szCs w:val="24"/>
+          <w:lang w:val="sv-SE"/>
+        </w:rPr>
+      </w:pPr>
+      <w:r>
+        <w:rPr>
+          <w:rFonts w:ascii="Times New Roman" w:hAnsi="Times New Roman" w:eastAsia="Times New Roman" w:cs="Times New Roman"/>
+          <w:noProof w:val="0"/>
+          <w:sz w:val="24"/>
+          <w:szCs w:val="24"/>
+          <w:lang w:val="sv-SE"/>
+        </w:rPr>
+        <w:t>Device name (e.g., White Light, Fan INA, Door)</w:t>
+      </w:r>
+    </w:p>
+    <w:p>
+      <w:pPr>
+        <w:pStyle w:val="ListParagraph"/>
+        <w:numPr>
+          <w:ilvl w:val="0"/>
+          <w:numId w:val="1"/>
+        </w:numPr>
+        <w:spacing w:before="240" w:beforeAutospacing="off" w:after="240" w:afterAutospacing="off"/>
+        <w:jc w:val="left"/>
+        <w:rPr>
+          <w:rFonts w:ascii="Times New Roman" w:hAnsi="Times New Roman" w:eastAsia="Times New Roman" w:cs="Times New Roman"/>
+          <w:noProof w:val="0"/>
+          <w:sz w:val="24"/>
+          <w:szCs w:val="24"/>
+          <w:lang w:val="sv-SE"/>
+        </w:rPr>
+      </w:pPr>
+      <w:r>
+        <w:rPr>
+          <w:rFonts w:ascii="Times New Roman" w:hAnsi="Times New Roman" w:eastAsia="Times New Roman" w:cs="Times New Roman"/>
+          <w:noProof w:val="0"/>
+          <w:sz w:val="24"/>
+          <w:szCs w:val="24"/>
+          <w:lang w:val="sv-SE"/>
+        </w:rPr>
+        <w:t>Hardware pin reference (e.g., Pin 13, Pin 9)</w:t>
+      </w:r>
+    </w:p>
+    <w:p>
+      <w:pPr>
+        <w:pStyle w:val="ListParagraph"/>
+        <w:numPr>
+          <w:ilvl w:val="0"/>
+          <w:numId w:val="1"/>
+        </w:numPr>
+        <w:spacing w:before="240" w:beforeAutospacing="off" w:after="240" w:afterAutospacing="off"/>
+        <w:jc w:val="left"/>
+        <w:rPr>
+          <w:rFonts w:ascii="Times New Roman" w:hAnsi="Times New Roman" w:eastAsia="Times New Roman" w:cs="Times New Roman"/>
+          <w:noProof w:val="0"/>
+          <w:sz w:val="24"/>
+          <w:szCs w:val="24"/>
+          <w:lang w:val="sv-SE"/>
+        </w:rPr>
+      </w:pPr>
+      <w:r>
+        <w:rPr>
+          <w:rFonts w:ascii="Times New Roman" w:hAnsi="Times New Roman" w:eastAsia="Times New Roman" w:cs="Times New Roman"/>
+          <w:noProof w:val="0"/>
+          <w:sz w:val="24"/>
+          <w:szCs w:val="24"/>
+          <w:lang w:val="sv-SE"/>
+        </w:rPr>
+        <w:t>Current device state (ON/OFF, OPEN/CLOSED)</w:t>
+      </w:r>
+    </w:p>
+    <w:p>
+      <w:pPr>
+        <w:spacing w:before="240" w:beforeAutospacing="off" w:after="240" w:afterAutospacing="off"/>
+        <w:jc w:val="left"/>
+      </w:pPr>
+      <w:r>
+        <w:rPr>
+          <w:rFonts w:ascii="Times New Roman" w:hAnsi="Times New Roman" w:eastAsia="Times New Roman" w:cs="Times New Roman"/>
+          <w:noProof w:val="0"/>
+          <w:sz w:val="24"/>
+          <w:szCs w:val="24"/>
+          <w:lang w:val="sv-SE"/>
+        </w:rPr>
+        <w:t>Navigation components:</w:t>
+      </w:r>
+    </w:p>
+    <w:p>
+      <w:pPr>
+        <w:pStyle w:val="ListParagraph"/>
+        <w:numPr>
+          <w:ilvl w:val="0"/>
+          <w:numId w:val="2"/>
+        </w:numPr>
+        <w:spacing w:before="240" w:beforeAutospacing="off" w:after="240" w:afterAutospacing="off"/>
+        <w:jc w:val="left"/>
+        <w:rPr>
+          <w:rFonts w:ascii="Times New Roman" w:hAnsi="Times New Roman" w:eastAsia="Times New Roman" w:cs="Times New Roman"/>
+          <w:noProof w:val="0"/>
+          <w:sz w:val="24"/>
+          <w:szCs w:val="24"/>
+          <w:lang w:val="sv-SE"/>
+        </w:rPr>
+      </w:pPr>
+      <w:r>
+        <w:rPr>
+          <w:rFonts w:ascii="Times New Roman" w:hAnsi="Times New Roman" w:eastAsia="Times New Roman" w:cs="Times New Roman"/>
+          <w:noProof w:val="0"/>
+          <w:sz w:val="24"/>
+          <w:szCs w:val="24"/>
+          <w:lang w:val="sv-SE"/>
+        </w:rPr>
+        <w:t>Top navigation header</w:t>
+      </w:r>
+    </w:p>
+    <w:p>
+      <w:pPr>
+        <w:pStyle w:val="ListParagraph"/>
+        <w:numPr>
+          <w:ilvl w:val="0"/>
+          <w:numId w:val="2"/>
+        </w:numPr>
+        <w:spacing w:before="240" w:beforeAutospacing="off" w:after="240" w:afterAutospacing="off"/>
+        <w:jc w:val="left"/>
+        <w:rPr>
+          <w:rFonts w:ascii="Times New Roman" w:hAnsi="Times New Roman" w:eastAsia="Times New Roman" w:cs="Times New Roman"/>
+          <w:noProof w:val="0"/>
+          <w:sz w:val="24"/>
+          <w:szCs w:val="24"/>
+          <w:lang w:val="sv-SE"/>
+        </w:rPr>
+      </w:pPr>
+      <w:r>
+        <w:rPr>
+          <w:rFonts w:ascii="Times New Roman" w:hAnsi="Times New Roman" w:eastAsia="Times New Roman" w:cs="Times New Roman"/>
+          <w:noProof w:val="0"/>
+          <w:sz w:val="24"/>
+          <w:szCs w:val="24"/>
+          <w:lang w:val="sv-SE"/>
+        </w:rPr>
+        <w:t>Links to Hub, AI, Music and Database</w:t>
+      </w:r>
+    </w:p>
+    <w:p>
+      <w:pPr>
+        <w:pStyle w:val="Rubrik3"/>
+        <w:spacing w:before="281" w:beforeAutospacing="off" w:after="281" w:afterAutospacing="off"/>
+        <w:jc w:val="left"/>
       </w:pPr>
       <w:r>
         <w:rPr>
@@ -2507,204 +2874,183 @@
           <w:b w:val="1"/>
           <w:bCs w:val="1"/>
           <w:noProof w:val="0"/>
-          <w:sz w:val="24"/>
-          <w:szCs w:val="24"/>
-          <w:lang w:val="en-GB"/>
-        </w:rPr>
-        <w:t xml:space="preserve"> </w:t>
-      </w:r>
-    </w:p>
-    <w:p>
-      <w:pPr>
-        <w:spacing w:before="0" w:beforeAutospacing="off" w:after="0" w:afterAutospacing="off"/>
-      </w:pPr>
-      <w:r>
+          <w:sz w:val="28"/>
+          <w:szCs w:val="28"/>
+          <w:lang w:val="sv-SE"/>
+        </w:rPr>
+        <w:t>Design</w:t>
+      </w:r>
+    </w:p>
+    <w:p>
+      <w:pPr>
+        <w:spacing w:before="240" w:beforeAutospacing="off" w:after="240" w:afterAutospacing="off"/>
+        <w:jc w:val="left"/>
+      </w:pPr>
+      <w:r>
+        <w:rPr>
+          <w:rFonts w:ascii="Times New Roman" w:hAnsi="Times New Roman" w:eastAsia="Times New Roman" w:cs="Times New Roman"/>
+          <w:noProof w:val="0"/>
+          <w:sz w:val="24"/>
+          <w:szCs w:val="24"/>
+          <w:lang w:val="sv-SE"/>
+        </w:rPr>
+        <w:t>Device data is retrieved dynamically from Firebase Firestore.</w:t>
+      </w:r>
+    </w:p>
+    <w:p>
+      <w:pPr>
+        <w:spacing w:before="240" w:beforeAutospacing="off" w:after="240" w:afterAutospacing="off"/>
+        <w:jc w:val="left"/>
+      </w:pPr>
+      <w:r>
+        <w:rPr>
+          <w:rFonts w:ascii="Times New Roman" w:hAnsi="Times New Roman" w:eastAsia="Times New Roman" w:cs="Times New Roman"/>
+          <w:noProof w:val="0"/>
+          <w:sz w:val="24"/>
+          <w:szCs w:val="24"/>
+          <w:lang w:val="sv-SE"/>
+        </w:rPr>
+        <w:t>The interface uses a card-based layout with dark theme styling, consistent with the mobile UI design.</w:t>
+      </w:r>
+    </w:p>
+    <w:p>
+      <w:pPr>
+        <w:spacing w:before="240" w:beforeAutospacing="off" w:after="240" w:afterAutospacing="off"/>
+        <w:jc w:val="left"/>
+      </w:pPr>
+      <w:r>
+        <w:rPr>
+          <w:rFonts w:ascii="Times New Roman" w:hAnsi="Times New Roman" w:eastAsia="Times New Roman" w:cs="Times New Roman"/>
+          <w:noProof w:val="0"/>
+          <w:sz w:val="24"/>
+          <w:szCs w:val="24"/>
+          <w:lang w:val="sv-SE"/>
+        </w:rPr>
+        <w:t>Each device card displays real-time information using Firebase snapshot listeners.</w:t>
+      </w:r>
+    </w:p>
+    <w:p>
+      <w:pPr>
+        <w:spacing w:before="240" w:beforeAutospacing="off" w:after="240" w:afterAutospacing="off"/>
+        <w:jc w:val="left"/>
+      </w:pPr>
+      <w:r>
+        <w:rPr>
+          <w:rFonts w:ascii="Times New Roman" w:hAnsi="Times New Roman" w:eastAsia="Times New Roman" w:cs="Times New Roman"/>
+          <w:noProof w:val="0"/>
+          <w:sz w:val="24"/>
+          <w:szCs w:val="24"/>
+          <w:lang w:val="sv-SE"/>
+        </w:rPr>
+        <w:t>The page functions as a monitoring interface, while device control actions are primarily executed through the Hub Control Panel.</w:t>
+      </w:r>
+    </w:p>
+    <w:p>
+      <w:pPr>
+        <w:spacing w:before="240" w:beforeAutospacing="off" w:after="240" w:afterAutospacing="off"/>
+        <w:jc w:val="left"/>
+      </w:pPr>
+      <w:r>
+        <w:rPr>
+          <w:rFonts w:ascii="Times New Roman" w:hAnsi="Times New Roman" w:eastAsia="Times New Roman" w:cs="Times New Roman"/>
+          <w:noProof w:val="0"/>
+          <w:sz w:val="24"/>
+          <w:szCs w:val="24"/>
+          <w:lang w:val="sv-SE"/>
+        </w:rPr>
+        <w:t>Guest mode allows users to view devices but disables any interaction with actuator controls.</w:t>
+      </w:r>
+    </w:p>
+    <w:p>
+      <w:pPr>
+        <w:jc w:val="left"/>
+      </w:pPr>
+    </w:p>
+    <w:p>
+      <w:pPr>
+        <w:pStyle w:val="Rubrik3"/>
+      </w:pPr>
+      <w:r>
+        <w:rPr>
+          <w:noProof w:val="0"/>
+          <w:lang w:val="sv-SE"/>
+        </w:rPr>
+        <w:t>D4. Web Hub Control Panel (Essential)</w:t>
+      </w:r>
+    </w:p>
+    <w:p>
+      <w:pPr>
+        <w:pStyle w:val="Normal"/>
         <w:rPr>
           <w:rFonts w:ascii="Times New Roman" w:hAnsi="Times New Roman" w:eastAsia="Times New Roman" w:cs="Times New Roman"/>
           <w:b w:val="1"/>
           <w:bCs w:val="1"/>
           <w:noProof w:val="0"/>
-          <w:sz w:val="24"/>
-          <w:szCs w:val="24"/>
-          <w:lang w:val="en-GB"/>
-        </w:rPr>
-        <w:t>Description</w:t>
-      </w:r>
-      <w:r>
-        <w:br/>
-      </w:r>
-      <w:r>
-        <w:rPr>
-          <w:rFonts w:ascii="Times New Roman" w:hAnsi="Times New Roman" w:eastAsia="Times New Roman" w:cs="Times New Roman"/>
-          <w:noProof w:val="0"/>
-          <w:sz w:val="24"/>
-          <w:szCs w:val="24"/>
-          <w:lang w:val="en-GB"/>
-        </w:rPr>
-        <w:t xml:space="preserve"> A devices overview page listing all connected devices/sensors with type, pin, and status.</w:t>
-      </w:r>
-    </w:p>
-    <w:p>
-      <w:pPr>
-        <w:spacing w:before="0" w:beforeAutospacing="off" w:after="0" w:afterAutospacing="off"/>
-      </w:pPr>
-      <w:r>
-        <w:rPr>
-          <w:rFonts w:ascii="Times New Roman" w:hAnsi="Times New Roman" w:eastAsia="Times New Roman" w:cs="Times New Roman"/>
-          <w:noProof w:val="0"/>
-          <w:sz w:val="24"/>
-          <w:szCs w:val="24"/>
-          <w:lang w:val="en-US"/>
-        </w:rPr>
-        <w:t xml:space="preserve"> </w:t>
-      </w:r>
-    </w:p>
-    <w:p>
-      <w:pPr>
-        <w:spacing w:before="0" w:beforeAutospacing="off" w:after="0" w:afterAutospacing="off"/>
-      </w:pPr>
-      <w:r>
-        <w:rPr>
-          <w:rFonts w:ascii="Times New Roman" w:hAnsi="Times New Roman" w:eastAsia="Times New Roman" w:cs="Times New Roman"/>
+          <w:sz w:val="28"/>
+          <w:szCs w:val="28"/>
+          <w:lang w:val="sv-SE"/>
+        </w:rPr>
+      </w:pPr>
+      <w:r>
+        <w:rPr>
           <w:b w:val="1"/>
           <w:bCs w:val="1"/>
           <w:noProof w:val="0"/>
-          <w:sz w:val="24"/>
-          <w:szCs w:val="24"/>
-          <w:lang w:val="sv-SE"/>
-        </w:rPr>
-        <w:t>Components</w:t>
-      </w:r>
-    </w:p>
-    <w:p>
-      <w:pPr>
-        <w:spacing w:before="0" w:beforeAutospacing="off" w:after="0" w:afterAutospacing="off"/>
-      </w:pPr>
-      <w:r>
-        <w:rPr>
-          <w:rFonts w:ascii="Times New Roman" w:hAnsi="Times New Roman" w:eastAsia="Times New Roman" w:cs="Times New Roman"/>
-          <w:noProof w:val="0"/>
-          <w:sz w:val="24"/>
-          <w:szCs w:val="24"/>
-          <w:lang w:val="sv-SE"/>
-        </w:rPr>
-        <w:t>Device cards grid (2 columns)</w:t>
-      </w:r>
-    </w:p>
-    <w:p>
-      <w:pPr>
-        <w:spacing w:before="0" w:beforeAutospacing="off" w:after="0" w:afterAutospacing="off"/>
-      </w:pPr>
-      <w:r>
-        <w:rPr>
-          <w:rFonts w:ascii="Times New Roman" w:hAnsi="Times New Roman" w:eastAsia="Times New Roman" w:cs="Times New Roman"/>
-          <w:noProof w:val="0"/>
-          <w:sz w:val="24"/>
-          <w:szCs w:val="24"/>
-          <w:lang w:val="sv-SE"/>
-        </w:rPr>
-        <w:t>Each card shows:</w:t>
-      </w:r>
-    </w:p>
-    <w:p>
-      <w:pPr>
-        <w:spacing w:before="0" w:beforeAutospacing="off" w:after="0" w:afterAutospacing="off"/>
-        <w:ind w:left="1440" w:right="0"/>
-      </w:pPr>
-      <w:r>
-        <w:rPr>
-          <w:rFonts w:ascii="Times New Roman" w:hAnsi="Times New Roman" w:eastAsia="Times New Roman" w:cs="Times New Roman"/>
-          <w:noProof w:val="0"/>
-          <w:sz w:val="24"/>
-          <w:szCs w:val="24"/>
-          <w:lang w:val="sv-SE"/>
-        </w:rPr>
-        <w:t>Device icon</w:t>
-      </w:r>
-    </w:p>
-    <w:p>
-      <w:pPr>
-        <w:spacing w:before="0" w:beforeAutospacing="off" w:after="0" w:afterAutospacing="off"/>
-        <w:ind w:left="1440" w:right="0"/>
-      </w:pPr>
-      <w:r>
-        <w:rPr>
-          <w:rFonts w:ascii="Times New Roman" w:hAnsi="Times New Roman" w:eastAsia="Times New Roman" w:cs="Times New Roman"/>
-          <w:noProof w:val="0"/>
-          <w:sz w:val="24"/>
-          <w:szCs w:val="24"/>
-          <w:lang w:val="sv-SE"/>
-        </w:rPr>
-        <w:t>Device name (e.g., Servo 1 (Door))</w:t>
-      </w:r>
-    </w:p>
-    <w:p>
-      <w:pPr>
-        <w:spacing w:before="0" w:beforeAutospacing="off" w:after="0" w:afterAutospacing="off"/>
-        <w:ind w:left="1440" w:right="0"/>
-      </w:pPr>
-      <w:r>
-        <w:rPr>
-          <w:rFonts w:ascii="Times New Roman" w:hAnsi="Times New Roman" w:eastAsia="Times New Roman" w:cs="Times New Roman"/>
-          <w:noProof w:val="0"/>
-          <w:sz w:val="24"/>
-          <w:szCs w:val="24"/>
-          <w:lang w:val="sv-SE"/>
-        </w:rPr>
-        <w:t>Pin label (e.g., D9, D11/A0, I2C SDA/SCL)</w:t>
-      </w:r>
-    </w:p>
-    <w:p>
-      <w:pPr>
-        <w:spacing w:before="0" w:beforeAutospacing="off" w:after="0" w:afterAutospacing="off"/>
-        <w:ind w:left="720" w:right="0"/>
-        <w:rPr>
-          <w:rFonts w:ascii="Times New Roman" w:hAnsi="Times New Roman" w:eastAsia="Times New Roman" w:cs="Times New Roman"/>
-          <w:noProof w:val="0"/>
-          <w:sz w:val="24"/>
-          <w:szCs w:val="24"/>
-          <w:lang w:val="sv-SE"/>
-        </w:rPr>
-      </w:pPr>
-      <w:r>
-        <w:rPr>
-          <w:rFonts w:ascii="Times New Roman" w:hAnsi="Times New Roman" w:eastAsia="Times New Roman" w:cs="Times New Roman"/>
-          <w:noProof w:val="0"/>
-          <w:sz w:val="24"/>
-          <w:szCs w:val="24"/>
-          <w:lang w:val="sv-SE"/>
-        </w:rPr>
-        <w:t xml:space="preserve">Top </w:t>
-      </w:r>
-      <w:r>
-        <w:rPr>
-          <w:rFonts w:ascii="Times New Roman" w:hAnsi="Times New Roman" w:eastAsia="Times New Roman" w:cs="Times New Roman"/>
-          <w:noProof w:val="0"/>
-          <w:sz w:val="24"/>
-          <w:szCs w:val="24"/>
-          <w:lang w:val="sv-SE"/>
-        </w:rPr>
-        <w:t>navigation tabs: Devices, AI, Speech, Hub, Database</w:t>
-      </w:r>
-    </w:p>
-    <w:p>
-      <w:pPr>
-        <w:spacing w:before="0" w:beforeAutospacing="off" w:after="0" w:afterAutospacing="off"/>
-      </w:pPr>
-      <w:r>
-        <w:rPr>
-          <w:rFonts w:ascii="Times New Roman" w:hAnsi="Times New Roman" w:eastAsia="Times New Roman" w:cs="Times New Roman"/>
-          <w:noProof w:val="0"/>
-          <w:sz w:val="24"/>
-          <w:szCs w:val="24"/>
-          <w:lang w:val="sv-SE"/>
-        </w:rPr>
-        <w:t xml:space="preserve"> </w:t>
-      </w:r>
-    </w:p>
-    <w:p>
-      <w:pPr>
-        <w:spacing w:before="0" w:beforeAutospacing="off" w:after="0" w:afterAutospacing="off"/>
+          <w:lang w:val="sv-SE"/>
+        </w:rPr>
+        <w:t>Description</w:t>
+      </w:r>
+    </w:p>
+    <w:p>
+      <w:pPr>
+        <w:spacing w:before="240" w:beforeAutospacing="off" w:after="240" w:afterAutospacing="off"/>
+        <w:jc w:val="left"/>
+      </w:pPr>
+      <w:r>
+        <w:rPr>
+          <w:rFonts w:ascii="Times New Roman" w:hAnsi="Times New Roman" w:eastAsia="Times New Roman" w:cs="Times New Roman"/>
+          <w:noProof w:val="0"/>
+          <w:sz w:val="24"/>
+          <w:szCs w:val="24"/>
+          <w:lang w:val="sv-SE"/>
+        </w:rPr>
+        <w:t>The Web Hub Control Panel serves as the main dashboard for interacting with smart home hardware devices.</w:t>
+      </w:r>
+      <w:r>
+        <w:br/>
+      </w:r>
+      <w:r>
+        <w:rPr>
+          <w:rFonts w:ascii="Times New Roman" w:hAnsi="Times New Roman" w:eastAsia="Times New Roman" w:cs="Times New Roman"/>
+          <w:noProof w:val="0"/>
+          <w:sz w:val="24"/>
+          <w:szCs w:val="24"/>
+          <w:lang w:val="sv-SE"/>
+        </w:rPr>
+        <w:t xml:space="preserve"> It provides real time control of actuators and monitoring of sensor telemetry through a unified interface.</w:t>
+      </w:r>
+    </w:p>
+    <w:p>
+      <w:pPr>
+        <w:spacing w:before="240" w:beforeAutospacing="off" w:after="240" w:afterAutospacing="off"/>
+        <w:jc w:val="left"/>
+      </w:pPr>
+      <w:r>
+        <w:rPr>
+          <w:rFonts w:ascii="Times New Roman" w:hAnsi="Times New Roman" w:eastAsia="Times New Roman" w:cs="Times New Roman"/>
+          <w:noProof w:val="0"/>
+          <w:sz w:val="24"/>
+          <w:szCs w:val="24"/>
+          <w:lang w:val="sv-SE"/>
+        </w:rPr>
+        <w:t>The hub aggregates device state information from the Firebase cloud database and allows authenticated users to update device states.</w:t>
+      </w:r>
+    </w:p>
+    <w:p>
+      <w:pPr>
+        <w:pStyle w:val="Rubrik3"/>
+        <w:spacing w:before="281" w:beforeAutospacing="off" w:after="281" w:afterAutospacing="off"/>
+        <w:jc w:val="left"/>
       </w:pPr>
       <w:r>
         <w:rPr>
@@ -2712,496 +3058,762 @@
           <w:b w:val="1"/>
           <w:bCs w:val="1"/>
           <w:noProof w:val="0"/>
-          <w:sz w:val="24"/>
-          <w:szCs w:val="24"/>
-          <w:lang w:val="sv-SE"/>
-        </w:rPr>
-        <w:t>Design</w:t>
-      </w:r>
-    </w:p>
-    <w:p>
-      <w:pPr>
-        <w:spacing w:before="0" w:beforeAutospacing="off" w:after="0" w:afterAutospacing="off"/>
-        <w:ind w:left="720" w:right="0"/>
-      </w:pPr>
-      <w:r>
-        <w:rPr>
-          <w:rFonts w:ascii="Times New Roman" w:hAnsi="Times New Roman" w:eastAsia="Times New Roman" w:cs="Times New Roman"/>
-          <w:noProof w:val="0"/>
-          <w:sz w:val="24"/>
-          <w:szCs w:val="24"/>
-          <w:lang w:val="sv-SE"/>
-        </w:rPr>
-        <w:t>Devices” page is read-only in Guest mode, interactive for logged-in users.</w:t>
-      </w:r>
-    </w:p>
-    <w:p>
-      <w:pPr>
-        <w:spacing w:before="0" w:beforeAutospacing="off" w:after="0" w:afterAutospacing="off"/>
-        <w:ind w:left="720" w:right="0"/>
-      </w:pPr>
-      <w:r>
-        <w:rPr>
-          <w:rFonts w:ascii="Times New Roman" w:hAnsi="Times New Roman" w:eastAsia="Times New Roman" w:cs="Times New Roman"/>
-          <w:noProof w:val="0"/>
-          <w:sz w:val="24"/>
-          <w:szCs w:val="24"/>
-          <w:lang w:val="sv-SE"/>
-        </w:rPr>
-        <w:t>Cards are consistent with dark UI + rounded corners + soft shadows (like screenshots).</w:t>
-      </w:r>
-    </w:p>
-    <w:p>
-      <w:pPr>
-        <w:spacing w:before="0" w:beforeAutospacing="off" w:after="0" w:afterAutospacing="off"/>
-        <w:ind w:left="720" w:right="0"/>
-      </w:pPr>
-      <w:r>
-        <w:rPr>
-          <w:rFonts w:ascii="Times New Roman" w:hAnsi="Times New Roman" w:eastAsia="Times New Roman" w:cs="Times New Roman"/>
-          <w:noProof w:val="0"/>
-          <w:sz w:val="24"/>
-          <w:szCs w:val="24"/>
-          <w:lang w:val="sv-SE"/>
-        </w:rPr>
-        <w:t>Clicking a card can route to a detail/control page (optional extension); in this design, most controls are centralized in Hub (D4/D5).</w:t>
-      </w:r>
-    </w:p>
-    <w:p>
-      <w:pPr>
-        <w:pStyle w:val="Normal"/>
-      </w:pPr>
+          <w:sz w:val="28"/>
+          <w:szCs w:val="28"/>
+          <w:lang w:val="sv-SE"/>
+        </w:rPr>
+        <w:t>Components</w:t>
+      </w:r>
+    </w:p>
+    <w:p>
+      <w:pPr>
+        <w:spacing w:before="240" w:beforeAutospacing="off" w:after="240" w:afterAutospacing="off"/>
+        <w:jc w:val="left"/>
+      </w:pPr>
+      <w:r>
+        <w:rPr>
+          <w:rFonts w:ascii="Times New Roman" w:hAnsi="Times New Roman" w:eastAsia="Times New Roman" w:cs="Times New Roman"/>
+          <w:noProof w:val="0"/>
+          <w:sz w:val="24"/>
+          <w:szCs w:val="24"/>
+          <w:lang w:val="sv-SE"/>
+        </w:rPr>
+        <w:t>Actuator control section:</w:t>
+      </w:r>
+    </w:p>
+    <w:p>
+      <w:pPr>
+        <w:pStyle w:val="ListParagraph"/>
+        <w:numPr>
+          <w:ilvl w:val="0"/>
+          <w:numId w:val="3"/>
+        </w:numPr>
+        <w:spacing w:before="240" w:beforeAutospacing="off" w:after="240" w:afterAutospacing="off"/>
+        <w:jc w:val="left"/>
+        <w:rPr>
+          <w:rFonts w:ascii="Times New Roman" w:hAnsi="Times New Roman" w:eastAsia="Times New Roman" w:cs="Times New Roman"/>
+          <w:noProof w:val="0"/>
+          <w:sz w:val="24"/>
+          <w:szCs w:val="24"/>
+          <w:lang w:val="sv-SE"/>
+        </w:rPr>
+      </w:pPr>
+      <w:r>
+        <w:rPr>
+          <w:rFonts w:ascii="Times New Roman" w:hAnsi="Times New Roman" w:eastAsia="Times New Roman" w:cs="Times New Roman"/>
+          <w:noProof w:val="0"/>
+          <w:sz w:val="24"/>
+          <w:szCs w:val="24"/>
+          <w:lang w:val="sv-SE"/>
+        </w:rPr>
+        <w:t>White Light toggle switch</w:t>
+      </w:r>
+    </w:p>
+    <w:p>
+      <w:pPr>
+        <w:pStyle w:val="ListParagraph"/>
+        <w:numPr>
+          <w:ilvl w:val="0"/>
+          <w:numId w:val="3"/>
+        </w:numPr>
+        <w:spacing w:before="240" w:beforeAutospacing="off" w:after="240" w:afterAutospacing="off"/>
+        <w:jc w:val="left"/>
+        <w:rPr>
+          <w:rFonts w:ascii="Times New Roman" w:hAnsi="Times New Roman" w:eastAsia="Times New Roman" w:cs="Times New Roman"/>
+          <w:noProof w:val="0"/>
+          <w:sz w:val="24"/>
+          <w:szCs w:val="24"/>
+          <w:lang w:val="sv-SE"/>
+        </w:rPr>
+      </w:pPr>
+      <w:r>
+        <w:rPr>
+          <w:rFonts w:ascii="Times New Roman" w:hAnsi="Times New Roman" w:eastAsia="Times New Roman" w:cs="Times New Roman"/>
+          <w:noProof w:val="0"/>
+          <w:sz w:val="24"/>
+          <w:szCs w:val="24"/>
+          <w:lang w:val="sv-SE"/>
+        </w:rPr>
+        <w:t>Orange Light toggle switch</w:t>
+      </w:r>
+    </w:p>
+    <w:p>
+      <w:pPr>
+        <w:pStyle w:val="ListParagraph"/>
+        <w:numPr>
+          <w:ilvl w:val="0"/>
+          <w:numId w:val="3"/>
+        </w:numPr>
+        <w:spacing w:before="240" w:beforeAutospacing="off" w:after="240" w:afterAutospacing="off"/>
+        <w:jc w:val="left"/>
+        <w:rPr>
+          <w:rFonts w:ascii="Times New Roman" w:hAnsi="Times New Roman" w:eastAsia="Times New Roman" w:cs="Times New Roman"/>
+          <w:noProof w:val="0"/>
+          <w:sz w:val="24"/>
+          <w:szCs w:val="24"/>
+          <w:lang w:val="sv-SE"/>
+        </w:rPr>
+      </w:pPr>
+      <w:r>
+        <w:rPr>
+          <w:rFonts w:ascii="Times New Roman" w:hAnsi="Times New Roman" w:eastAsia="Times New Roman" w:cs="Times New Roman"/>
+          <w:noProof w:val="0"/>
+          <w:sz w:val="24"/>
+          <w:szCs w:val="24"/>
+          <w:lang w:val="sv-SE"/>
+        </w:rPr>
+        <w:t>Fan INA control toggle</w:t>
+      </w:r>
+    </w:p>
+    <w:p>
+      <w:pPr>
+        <w:pStyle w:val="ListParagraph"/>
+        <w:numPr>
+          <w:ilvl w:val="0"/>
+          <w:numId w:val="3"/>
+        </w:numPr>
+        <w:spacing w:before="240" w:beforeAutospacing="off" w:after="240" w:afterAutospacing="off"/>
+        <w:jc w:val="left"/>
+        <w:rPr>
+          <w:rFonts w:ascii="Times New Roman" w:hAnsi="Times New Roman" w:eastAsia="Times New Roman" w:cs="Times New Roman"/>
+          <w:noProof w:val="0"/>
+          <w:sz w:val="24"/>
+          <w:szCs w:val="24"/>
+          <w:lang w:val="sv-SE"/>
+        </w:rPr>
+      </w:pPr>
+      <w:r>
+        <w:rPr>
+          <w:rFonts w:ascii="Times New Roman" w:hAnsi="Times New Roman" w:eastAsia="Times New Roman" w:cs="Times New Roman"/>
+          <w:noProof w:val="0"/>
+          <w:sz w:val="24"/>
+          <w:szCs w:val="24"/>
+          <w:lang w:val="sv-SE"/>
+        </w:rPr>
+        <w:t>Fan INB control toggle</w:t>
+      </w:r>
+    </w:p>
+    <w:p>
+      <w:pPr>
+        <w:pStyle w:val="ListParagraph"/>
+        <w:numPr>
+          <w:ilvl w:val="0"/>
+          <w:numId w:val="3"/>
+        </w:numPr>
+        <w:spacing w:before="240" w:beforeAutospacing="off" w:after="240" w:afterAutospacing="off"/>
+        <w:jc w:val="left"/>
+        <w:rPr>
+          <w:rFonts w:ascii="Times New Roman" w:hAnsi="Times New Roman" w:eastAsia="Times New Roman" w:cs="Times New Roman"/>
+          <w:noProof w:val="0"/>
+          <w:sz w:val="24"/>
+          <w:szCs w:val="24"/>
+          <w:lang w:val="sv-SE"/>
+        </w:rPr>
+      </w:pPr>
+      <w:r>
+        <w:rPr>
+          <w:rFonts w:ascii="Times New Roman" w:hAnsi="Times New Roman" w:eastAsia="Times New Roman" w:cs="Times New Roman"/>
+          <w:noProof w:val="0"/>
+          <w:sz w:val="24"/>
+          <w:szCs w:val="24"/>
+          <w:lang w:val="sv-SE"/>
+        </w:rPr>
+        <w:t>Door servo control (open/close)</w:t>
+      </w:r>
+    </w:p>
+    <w:p>
+      <w:pPr>
+        <w:pStyle w:val="ListParagraph"/>
+        <w:numPr>
+          <w:ilvl w:val="0"/>
+          <w:numId w:val="3"/>
+        </w:numPr>
+        <w:spacing w:before="240" w:beforeAutospacing="off" w:after="240" w:afterAutospacing="off"/>
+        <w:jc w:val="left"/>
+        <w:rPr>
+          <w:rFonts w:ascii="Times New Roman" w:hAnsi="Times New Roman" w:eastAsia="Times New Roman" w:cs="Times New Roman"/>
+          <w:noProof w:val="0"/>
+          <w:sz w:val="24"/>
+          <w:szCs w:val="24"/>
+          <w:lang w:val="sv-SE"/>
+        </w:rPr>
+      </w:pPr>
+      <w:r>
+        <w:rPr>
+          <w:rFonts w:ascii="Times New Roman" w:hAnsi="Times New Roman" w:eastAsia="Times New Roman" w:cs="Times New Roman"/>
+          <w:noProof w:val="0"/>
+          <w:sz w:val="24"/>
+          <w:szCs w:val="24"/>
+          <w:lang w:val="sv-SE"/>
+        </w:rPr>
+        <w:t>Window servo control (open/close)</w:t>
+      </w:r>
+    </w:p>
+    <w:p>
+      <w:pPr>
+        <w:spacing w:before="240" w:beforeAutospacing="off" w:after="240" w:afterAutospacing="off"/>
+        <w:jc w:val="left"/>
+      </w:pPr>
+      <w:r>
+        <w:rPr>
+          <w:rFonts w:ascii="Times New Roman" w:hAnsi="Times New Roman" w:eastAsia="Times New Roman" w:cs="Times New Roman"/>
+          <w:noProof w:val="0"/>
+          <w:sz w:val="24"/>
+          <w:szCs w:val="24"/>
+          <w:lang w:val="sv-SE"/>
+        </w:rPr>
+        <w:t>Sensor monitoring section:</w:t>
+      </w:r>
+    </w:p>
+    <w:p>
+      <w:pPr>
+        <w:pStyle w:val="ListParagraph"/>
+        <w:numPr>
+          <w:ilvl w:val="0"/>
+          <w:numId w:val="4"/>
+        </w:numPr>
+        <w:spacing w:before="240" w:beforeAutospacing="off" w:after="240" w:afterAutospacing="off"/>
+        <w:jc w:val="left"/>
+        <w:rPr>
+          <w:rFonts w:ascii="Times New Roman" w:hAnsi="Times New Roman" w:eastAsia="Times New Roman" w:cs="Times New Roman"/>
+          <w:noProof w:val="0"/>
+          <w:sz w:val="24"/>
+          <w:szCs w:val="24"/>
+          <w:lang w:val="sv-SE"/>
+        </w:rPr>
+      </w:pPr>
+      <w:r>
+        <w:rPr>
+          <w:rFonts w:ascii="Times New Roman" w:hAnsi="Times New Roman" w:eastAsia="Times New Roman" w:cs="Times New Roman"/>
+          <w:noProof w:val="0"/>
+          <w:sz w:val="24"/>
+          <w:szCs w:val="24"/>
+          <w:lang w:val="sv-SE"/>
+        </w:rPr>
+        <w:t>Motion sensor status indicator</w:t>
+      </w:r>
+    </w:p>
+    <w:p>
+      <w:pPr>
+        <w:pStyle w:val="ListParagraph"/>
+        <w:numPr>
+          <w:ilvl w:val="0"/>
+          <w:numId w:val="4"/>
+        </w:numPr>
+        <w:spacing w:before="240" w:beforeAutospacing="off" w:after="240" w:afterAutospacing="off"/>
+        <w:jc w:val="left"/>
+        <w:rPr>
+          <w:rFonts w:ascii="Times New Roman" w:hAnsi="Times New Roman" w:eastAsia="Times New Roman" w:cs="Times New Roman"/>
+          <w:noProof w:val="0"/>
+          <w:sz w:val="24"/>
+          <w:szCs w:val="24"/>
+          <w:lang w:val="sv-SE"/>
+        </w:rPr>
+      </w:pPr>
+      <w:r>
+        <w:rPr>
+          <w:rFonts w:ascii="Times New Roman" w:hAnsi="Times New Roman" w:eastAsia="Times New Roman" w:cs="Times New Roman"/>
+          <w:noProof w:val="0"/>
+          <w:sz w:val="24"/>
+          <w:szCs w:val="24"/>
+          <w:lang w:val="sv-SE"/>
+        </w:rPr>
+        <w:t>Steam sensor raw value display</w:t>
+      </w:r>
+    </w:p>
+    <w:p>
+      <w:pPr>
+        <w:pStyle w:val="ListParagraph"/>
+        <w:numPr>
+          <w:ilvl w:val="0"/>
+          <w:numId w:val="4"/>
+        </w:numPr>
+        <w:spacing w:before="240" w:beforeAutospacing="off" w:after="240" w:afterAutospacing="off"/>
+        <w:jc w:val="left"/>
+        <w:rPr>
+          <w:rFonts w:ascii="Times New Roman" w:hAnsi="Times New Roman" w:eastAsia="Times New Roman" w:cs="Times New Roman"/>
+          <w:noProof w:val="0"/>
+          <w:sz w:val="24"/>
+          <w:szCs w:val="24"/>
+          <w:lang w:val="sv-SE"/>
+        </w:rPr>
+      </w:pPr>
+      <w:r>
+        <w:rPr>
+          <w:rFonts w:ascii="Times New Roman" w:hAnsi="Times New Roman" w:eastAsia="Times New Roman" w:cs="Times New Roman"/>
+          <w:noProof w:val="0"/>
+          <w:sz w:val="24"/>
+          <w:szCs w:val="24"/>
+          <w:lang w:val="sv-SE"/>
+        </w:rPr>
+        <w:t>Gas sensor raw value and alert indicator</w:t>
+      </w:r>
+    </w:p>
+    <w:p>
+      <w:pPr>
+        <w:spacing w:before="240" w:beforeAutospacing="off" w:after="240" w:afterAutospacing="off"/>
+        <w:jc w:val="left"/>
+      </w:pPr>
+      <w:r>
+        <w:rPr>
+          <w:rFonts w:ascii="Times New Roman" w:hAnsi="Times New Roman" w:eastAsia="Times New Roman" w:cs="Times New Roman"/>
+          <w:noProof w:val="0"/>
+          <w:sz w:val="24"/>
+          <w:szCs w:val="24"/>
+          <w:lang w:val="sv-SE"/>
+        </w:rPr>
+        <w:t>System synchronization section:</w:t>
+      </w:r>
+    </w:p>
+    <w:p>
+      <w:pPr>
+        <w:pStyle w:val="ListParagraph"/>
+        <w:numPr>
+          <w:ilvl w:val="0"/>
+          <w:numId w:val="5"/>
+        </w:numPr>
+        <w:spacing w:before="240" w:beforeAutospacing="off" w:after="240" w:afterAutospacing="off"/>
+        <w:jc w:val="left"/>
+        <w:rPr>
+          <w:rFonts w:ascii="Times New Roman" w:hAnsi="Times New Roman" w:eastAsia="Times New Roman" w:cs="Times New Roman"/>
+          <w:noProof w:val="0"/>
+          <w:sz w:val="24"/>
+          <w:szCs w:val="24"/>
+          <w:lang w:val="sv-SE"/>
+        </w:rPr>
+      </w:pPr>
+      <w:r>
+        <w:rPr>
+          <w:rFonts w:ascii="Times New Roman" w:hAnsi="Times New Roman" w:eastAsia="Times New Roman" w:cs="Times New Roman"/>
+          <w:noProof w:val="0"/>
+          <w:sz w:val="24"/>
+          <w:szCs w:val="24"/>
+          <w:lang w:val="sv-SE"/>
+        </w:rPr>
+        <w:t>Arduino synchronization status</w:t>
+      </w:r>
+    </w:p>
+    <w:p>
+      <w:pPr>
+        <w:pStyle w:val="ListParagraph"/>
+        <w:numPr>
+          <w:ilvl w:val="0"/>
+          <w:numId w:val="5"/>
+        </w:numPr>
+        <w:spacing w:before="240" w:beforeAutospacing="off" w:after="240" w:afterAutospacing="off"/>
+        <w:jc w:val="left"/>
+        <w:rPr>
+          <w:rFonts w:ascii="Times New Roman" w:hAnsi="Times New Roman" w:eastAsia="Times New Roman" w:cs="Times New Roman"/>
+          <w:noProof w:val="0"/>
+          <w:sz w:val="24"/>
+          <w:szCs w:val="24"/>
+          <w:lang w:val="sv-SE"/>
+        </w:rPr>
+      </w:pPr>
+      <w:r>
+        <w:rPr>
+          <w:rFonts w:ascii="Times New Roman" w:hAnsi="Times New Roman" w:eastAsia="Times New Roman" w:cs="Times New Roman"/>
+          <w:noProof w:val="0"/>
+          <w:sz w:val="24"/>
+          <w:szCs w:val="24"/>
+          <w:lang w:val="sv-SE"/>
+        </w:rPr>
+        <w:t>Last source of update</w:t>
+      </w:r>
+    </w:p>
+    <w:p>
+      <w:pPr>
+        <w:pStyle w:val="ListParagraph"/>
+        <w:numPr>
+          <w:ilvl w:val="0"/>
+          <w:numId w:val="5"/>
+        </w:numPr>
+        <w:spacing w:before="240" w:beforeAutospacing="off" w:after="240" w:afterAutospacing="off"/>
+        <w:jc w:val="left"/>
+        <w:rPr>
+          <w:rFonts w:ascii="Times New Roman" w:hAnsi="Times New Roman" w:eastAsia="Times New Roman" w:cs="Times New Roman"/>
+          <w:noProof w:val="0"/>
+          <w:sz w:val="24"/>
+          <w:szCs w:val="24"/>
+          <w:lang w:val="sv-SE"/>
+        </w:rPr>
+      </w:pPr>
+      <w:r>
+        <w:rPr>
+          <w:rFonts w:ascii="Times New Roman" w:hAnsi="Times New Roman" w:eastAsia="Times New Roman" w:cs="Times New Roman"/>
+          <w:noProof w:val="0"/>
+          <w:sz w:val="24"/>
+          <w:szCs w:val="24"/>
+          <w:lang w:val="sv-SE"/>
+        </w:rPr>
+        <w:t>Last updated timestamp</w:t>
+      </w:r>
+    </w:p>
+    <w:p>
+      <w:pPr>
+        <w:spacing w:before="240" w:beforeAutospacing="off" w:after="240" w:afterAutospacing="off"/>
+        <w:jc w:val="left"/>
+      </w:pPr>
+      <w:r>
+        <w:rPr>
+          <w:rFonts w:ascii="Times New Roman" w:hAnsi="Times New Roman" w:eastAsia="Times New Roman" w:cs="Times New Roman"/>
+          <w:noProof w:val="0"/>
+          <w:sz w:val="24"/>
+          <w:szCs w:val="24"/>
+          <w:lang w:val="sv-SE"/>
+        </w:rPr>
+        <w:t>User interface elements:</w:t>
+      </w:r>
+    </w:p>
+    <w:p>
+      <w:pPr>
+        <w:pStyle w:val="ListParagraph"/>
+        <w:numPr>
+          <w:ilvl w:val="0"/>
+          <w:numId w:val="6"/>
+        </w:numPr>
+        <w:spacing w:before="240" w:beforeAutospacing="off" w:after="240" w:afterAutospacing="off"/>
+        <w:jc w:val="left"/>
+        <w:rPr>
+          <w:rFonts w:ascii="Times New Roman" w:hAnsi="Times New Roman" w:eastAsia="Times New Roman" w:cs="Times New Roman"/>
+          <w:noProof w:val="0"/>
+          <w:sz w:val="24"/>
+          <w:szCs w:val="24"/>
+          <w:lang w:val="sv-SE"/>
+        </w:rPr>
+      </w:pPr>
+      <w:r>
+        <w:rPr>
+          <w:rFonts w:ascii="Times New Roman" w:hAnsi="Times New Roman" w:eastAsia="Times New Roman" w:cs="Times New Roman"/>
+          <w:noProof w:val="0"/>
+          <w:sz w:val="24"/>
+          <w:szCs w:val="24"/>
+          <w:lang w:val="sv-SE"/>
+        </w:rPr>
+        <w:t>Toggle buttons for device control</w:t>
+      </w:r>
+    </w:p>
+    <w:p>
+      <w:pPr>
+        <w:pStyle w:val="ListParagraph"/>
+        <w:numPr>
+          <w:ilvl w:val="0"/>
+          <w:numId w:val="6"/>
+        </w:numPr>
+        <w:spacing w:before="240" w:beforeAutospacing="off" w:after="240" w:afterAutospacing="off"/>
+        <w:jc w:val="left"/>
+        <w:rPr>
+          <w:rFonts w:ascii="Times New Roman" w:hAnsi="Times New Roman" w:eastAsia="Times New Roman" w:cs="Times New Roman"/>
+          <w:noProof w:val="0"/>
+          <w:sz w:val="24"/>
+          <w:szCs w:val="24"/>
+          <w:lang w:val="sv-SE"/>
+        </w:rPr>
+      </w:pPr>
+      <w:r>
+        <w:rPr>
+          <w:rFonts w:ascii="Times New Roman" w:hAnsi="Times New Roman" w:eastAsia="Times New Roman" w:cs="Times New Roman"/>
+          <w:noProof w:val="0"/>
+          <w:sz w:val="24"/>
+          <w:szCs w:val="24"/>
+          <w:lang w:val="sv-SE"/>
+        </w:rPr>
+        <w:t>Real time sensor value display</w:t>
+      </w:r>
+    </w:p>
+    <w:p>
+      <w:pPr>
+        <w:pStyle w:val="ListParagraph"/>
+        <w:numPr>
+          <w:ilvl w:val="0"/>
+          <w:numId w:val="6"/>
+        </w:numPr>
+        <w:spacing w:before="240" w:beforeAutospacing="off" w:after="240" w:afterAutospacing="off"/>
+        <w:jc w:val="left"/>
+        <w:rPr>
+          <w:rFonts w:ascii="Times New Roman" w:hAnsi="Times New Roman" w:eastAsia="Times New Roman" w:cs="Times New Roman"/>
+          <w:noProof w:val="0"/>
+          <w:sz w:val="24"/>
+          <w:szCs w:val="24"/>
+          <w:lang w:val="sv-SE"/>
+        </w:rPr>
+      </w:pPr>
+      <w:r>
+        <w:rPr>
+          <w:rFonts w:ascii="Times New Roman" w:hAnsi="Times New Roman" w:eastAsia="Times New Roman" w:cs="Times New Roman"/>
+          <w:noProof w:val="0"/>
+          <w:sz w:val="24"/>
+          <w:szCs w:val="24"/>
+          <w:lang w:val="sv-SE"/>
+        </w:rPr>
+        <w:t>Visual alerts for abnormal sensor states</w:t>
+      </w:r>
     </w:p>
     <w:p>
       <w:pPr>
         <w:pStyle w:val="Rubrik3"/>
-        <w:spacing w:before="240" w:beforeAutospacing="off" w:after="60" w:afterAutospacing="off"/>
-      </w:pPr>
-      <w:r>
-        <w:rPr>
-          <w:rFonts w:ascii="Arial" w:hAnsi="Arial" w:eastAsia="Arial" w:cs="Arial"/>
+        <w:spacing w:before="281" w:beforeAutospacing="off" w:after="281" w:afterAutospacing="off"/>
+        <w:jc w:val="left"/>
+      </w:pPr>
+      <w:r>
+        <w:rPr>
+          <w:rFonts w:ascii="Times New Roman" w:hAnsi="Times New Roman" w:eastAsia="Times New Roman" w:cs="Times New Roman"/>
           <w:b w:val="1"/>
           <w:bCs w:val="1"/>
           <w:noProof w:val="0"/>
-          <w:sz w:val="26"/>
-          <w:szCs w:val="26"/>
-          <w:lang w:val="en-GB"/>
-        </w:rPr>
-        <w:t xml:space="preserve">D4. </w:t>
-      </w:r>
-      <w:r>
-        <w:rPr>
-          <w:rFonts w:ascii="Arial" w:hAnsi="Arial" w:eastAsia="Arial" w:cs="Arial"/>
+          <w:sz w:val="28"/>
+          <w:szCs w:val="28"/>
+          <w:lang w:val="sv-SE"/>
+        </w:rPr>
+        <w:t>Design</w:t>
+      </w:r>
+    </w:p>
+    <w:p>
+      <w:pPr>
+        <w:spacing w:before="240" w:beforeAutospacing="off" w:after="240" w:afterAutospacing="off"/>
+        <w:jc w:val="left"/>
+      </w:pPr>
+      <w:r>
+        <w:rPr>
+          <w:rFonts w:ascii="Times New Roman" w:hAnsi="Times New Roman" w:eastAsia="Times New Roman" w:cs="Times New Roman"/>
+          <w:noProof w:val="0"/>
+          <w:sz w:val="24"/>
+          <w:szCs w:val="24"/>
+          <w:lang w:val="en-US"/>
+        </w:rPr>
+        <w:t xml:space="preserve">The Hub Control Panel is connected to </w:t>
+      </w:r>
+      <w:r>
+        <w:rPr>
+          <w:rFonts w:ascii="Times New Roman" w:hAnsi="Times New Roman" w:eastAsia="Times New Roman" w:cs="Times New Roman"/>
           <w:b w:val="1"/>
           <w:bCs w:val="1"/>
           <w:noProof w:val="0"/>
-          <w:sz w:val="26"/>
-          <w:szCs w:val="26"/>
-          <w:lang w:val="en-GB"/>
-        </w:rPr>
-        <w:t xml:space="preserve">Web </w:t>
-      </w:r>
-      <w:r>
-        <w:rPr>
-          <w:rFonts w:ascii="Arial" w:hAnsi="Arial" w:eastAsia="Arial" w:cs="Arial"/>
-          <w:b w:val="1"/>
-          <w:bCs w:val="1"/>
-          <w:noProof w:val="0"/>
-          <w:sz w:val="26"/>
-          <w:szCs w:val="26"/>
-          <w:lang w:val="en-GB"/>
-        </w:rPr>
-        <w:t>Hub Control Panel (Essential)</w:t>
+          <w:sz w:val="24"/>
+          <w:szCs w:val="24"/>
+          <w:lang w:val="en-US"/>
+        </w:rPr>
+        <w:t>Firebase Firestore</w:t>
+      </w:r>
+      <w:r>
+        <w:rPr>
+          <w:rFonts w:ascii="Times New Roman" w:hAnsi="Times New Roman" w:eastAsia="Times New Roman" w:cs="Times New Roman"/>
+          <w:noProof w:val="0"/>
+          <w:sz w:val="24"/>
+          <w:szCs w:val="24"/>
+          <w:lang w:val="en-US"/>
+        </w:rPr>
+        <w:t xml:space="preserve"> using real time listeners (</w:t>
+      </w:r>
+      <w:r>
+        <w:rPr>
+          <w:rFonts w:ascii="Consolas" w:hAnsi="Consolas" w:eastAsia="Consolas" w:cs="Consolas"/>
+          <w:noProof w:val="0"/>
+          <w:sz w:val="24"/>
+          <w:szCs w:val="24"/>
+          <w:lang w:val="en-US"/>
+        </w:rPr>
+        <w:t>onSnapshot</w:t>
+      </w:r>
+      <w:r>
+        <w:rPr>
+          <w:rFonts w:ascii="Times New Roman" w:hAnsi="Times New Roman" w:eastAsia="Times New Roman" w:cs="Times New Roman"/>
+          <w:noProof w:val="0"/>
+          <w:sz w:val="24"/>
+          <w:szCs w:val="24"/>
+          <w:lang w:val="en-US"/>
+        </w:rPr>
+        <w:t>).</w:t>
+      </w:r>
+      <w:r>
+        <w:br/>
+      </w:r>
+      <w:r>
+        <w:rPr>
+          <w:rFonts w:ascii="Times New Roman" w:hAnsi="Times New Roman" w:eastAsia="Times New Roman" w:cs="Times New Roman"/>
+          <w:noProof w:val="0"/>
+          <w:sz w:val="24"/>
+          <w:szCs w:val="24"/>
+          <w:lang w:val="en-US"/>
+        </w:rPr>
+        <w:t xml:space="preserve"> Device states are synchronized instantly between the web dashboard and the hardware system.</w:t>
+      </w:r>
+    </w:p>
+    <w:p>
+      <w:pPr>
+        <w:spacing w:before="240" w:beforeAutospacing="off" w:after="240" w:afterAutospacing="off"/>
+        <w:jc w:val="left"/>
+      </w:pPr>
+      <w:r>
+        <w:rPr>
+          <w:rFonts w:ascii="Times New Roman" w:hAnsi="Times New Roman" w:eastAsia="Times New Roman" w:cs="Times New Roman"/>
+          <w:noProof w:val="0"/>
+          <w:sz w:val="24"/>
+          <w:szCs w:val="24"/>
+          <w:lang w:val="sv-SE"/>
+        </w:rPr>
+        <w:t xml:space="preserve">When a user interacts with a control toggle, the application sends an update request to Firestore using </w:t>
+      </w:r>
+      <w:r>
+        <w:rPr>
+          <w:rFonts w:ascii="Consolas" w:hAnsi="Consolas" w:eastAsia="Consolas" w:cs="Consolas"/>
+          <w:noProof w:val="0"/>
+          <w:sz w:val="24"/>
+          <w:szCs w:val="24"/>
+          <w:lang w:val="sv-SE"/>
+        </w:rPr>
+        <w:t>updateDoc()</w:t>
+      </w:r>
+      <w:r>
+        <w:rPr>
+          <w:rFonts w:ascii="Times New Roman" w:hAnsi="Times New Roman" w:eastAsia="Times New Roman" w:cs="Times New Roman"/>
+          <w:noProof w:val="0"/>
+          <w:sz w:val="24"/>
+          <w:szCs w:val="24"/>
+          <w:lang w:val="sv-SE"/>
+        </w:rPr>
+        <w:t>.</w:t>
+      </w:r>
+      <w:r>
+        <w:br/>
+      </w:r>
+      <w:r>
+        <w:rPr>
+          <w:rFonts w:ascii="Times New Roman" w:hAnsi="Times New Roman" w:eastAsia="Times New Roman" w:cs="Times New Roman"/>
+          <w:noProof w:val="0"/>
+          <w:sz w:val="24"/>
+          <w:szCs w:val="24"/>
+          <w:lang w:val="sv-SE"/>
+        </w:rPr>
+        <w:t xml:space="preserve"> The Arduino system reads these updates and performs the corresponding hardware actions.</w:t>
+      </w:r>
+    </w:p>
+    <w:p>
+      <w:pPr>
+        <w:spacing w:before="240" w:beforeAutospacing="off" w:after="240" w:afterAutospacing="off"/>
+        <w:jc w:val="left"/>
+      </w:pPr>
+      <w:r>
+        <w:rPr>
+          <w:rFonts w:ascii="Times New Roman" w:hAnsi="Times New Roman" w:eastAsia="Times New Roman" w:cs="Times New Roman"/>
+          <w:noProof w:val="0"/>
+          <w:sz w:val="24"/>
+          <w:szCs w:val="24"/>
+          <w:lang w:val="sv-SE"/>
+        </w:rPr>
+        <w:t>The UI automatically updates whenever device or sensor values change, ensuring that the dashboard always reflects the current hardware state.</w:t>
+      </w:r>
+    </w:p>
+    <w:p>
+      <w:pPr>
+        <w:spacing w:before="240" w:beforeAutospacing="off" w:after="240" w:afterAutospacing="off"/>
+        <w:jc w:val="left"/>
+      </w:pPr>
+      <w:r>
+        <w:rPr>
+          <w:rFonts w:ascii="Times New Roman" w:hAnsi="Times New Roman" w:eastAsia="Times New Roman" w:cs="Times New Roman"/>
+          <w:noProof w:val="0"/>
+          <w:sz w:val="24"/>
+          <w:szCs w:val="24"/>
+          <w:lang w:val="sv-SE"/>
+        </w:rPr>
+        <w:t>Access control rules:</w:t>
+      </w:r>
+    </w:p>
+    <w:p>
+      <w:pPr>
+        <w:pStyle w:val="ListParagraph"/>
+        <w:numPr>
+          <w:ilvl w:val="0"/>
+          <w:numId w:val="7"/>
+        </w:numPr>
+        <w:spacing w:before="240" w:beforeAutospacing="off" w:after="240" w:afterAutospacing="off"/>
+        <w:jc w:val="left"/>
+        <w:rPr>
+          <w:rFonts w:ascii="Times New Roman" w:hAnsi="Times New Roman" w:eastAsia="Times New Roman" w:cs="Times New Roman"/>
+          <w:noProof w:val="0"/>
+          <w:sz w:val="24"/>
+          <w:szCs w:val="24"/>
+          <w:lang w:val="sv-SE"/>
+        </w:rPr>
+      </w:pPr>
+      <w:r>
+        <w:rPr>
+          <w:rFonts w:ascii="Times New Roman" w:hAnsi="Times New Roman" w:eastAsia="Times New Roman" w:cs="Times New Roman"/>
+          <w:noProof w:val="0"/>
+          <w:sz w:val="24"/>
+          <w:szCs w:val="24"/>
+          <w:lang w:val="sv-SE"/>
+        </w:rPr>
+        <w:t>Authenticated users can control actuators.</w:t>
+      </w:r>
+    </w:p>
+    <w:p>
+      <w:pPr>
+        <w:pStyle w:val="ListParagraph"/>
+        <w:numPr>
+          <w:ilvl w:val="0"/>
+          <w:numId w:val="7"/>
+        </w:numPr>
+        <w:spacing w:before="240" w:beforeAutospacing="off" w:after="240" w:afterAutospacing="off"/>
+        <w:jc w:val="left"/>
+        <w:rPr>
+          <w:rFonts w:ascii="Times New Roman" w:hAnsi="Times New Roman" w:eastAsia="Times New Roman" w:cs="Times New Roman"/>
+          <w:noProof w:val="0"/>
+          <w:sz w:val="24"/>
+          <w:szCs w:val="24"/>
+          <w:lang w:val="sv-SE"/>
+        </w:rPr>
+      </w:pPr>
+      <w:r>
+        <w:rPr>
+          <w:rFonts w:ascii="Times New Roman" w:hAnsi="Times New Roman" w:eastAsia="Times New Roman" w:cs="Times New Roman"/>
+          <w:noProof w:val="0"/>
+          <w:sz w:val="24"/>
+          <w:szCs w:val="24"/>
+          <w:lang w:val="sv-SE"/>
+        </w:rPr>
+        <w:t>Guest users can view sensor data but cannot modify device states.</w:t>
+      </w:r>
+    </w:p>
+    <w:p>
+      <w:pPr>
+        <w:spacing w:before="240" w:beforeAutospacing="off" w:after="240" w:afterAutospacing="off"/>
+        <w:jc w:val="left"/>
+        <w:rPr>
+          <w:rFonts w:ascii="Times New Roman" w:hAnsi="Times New Roman" w:eastAsia="Times New Roman" w:cs="Times New Roman"/>
+          <w:b w:val="0"/>
+          <w:bCs w:val="0"/>
+          <w:noProof w:val="0"/>
+          <w:sz w:val="24"/>
+          <w:szCs w:val="24"/>
+          <w:lang w:val="sv-SE"/>
+        </w:rPr>
+      </w:pPr>
+      <w:r>
+        <w:rPr>
+          <w:rFonts w:ascii="Times New Roman" w:hAnsi="Times New Roman" w:eastAsia="Times New Roman" w:cs="Times New Roman"/>
+          <w:b w:val="0"/>
+          <w:bCs w:val="0"/>
+          <w:noProof w:val="0"/>
+          <w:sz w:val="24"/>
+          <w:szCs w:val="24"/>
+          <w:lang w:val="sv-SE"/>
+        </w:rPr>
+        <w:t>The design ensures real-time communication between the web interface, cloud database, and hardware layer.</w:t>
       </w:r>
     </w:p>
     <w:p>
       <w:pPr>
         <w:spacing w:before="0" w:beforeAutospacing="off" w:after="0" w:afterAutospacing="off"/>
-      </w:pPr>
-      <w:r>
-        <w:rPr>
-          <w:rFonts w:ascii="Times New Roman" w:hAnsi="Times New Roman" w:eastAsia="Times New Roman" w:cs="Times New Roman"/>
-          <w:noProof w:val="0"/>
-          <w:sz w:val="24"/>
-          <w:szCs w:val="24"/>
-          <w:lang w:val="sv-SE"/>
-        </w:rPr>
-        <w:t xml:space="preserve"> </w:t>
-      </w:r>
-    </w:p>
-    <w:p>
-      <w:pPr>
-        <w:spacing w:before="0" w:beforeAutospacing="off" w:after="0" w:afterAutospacing="off"/>
-      </w:pPr>
-      <w:r>
-        <w:rPr>
-          <w:rFonts w:ascii="Times New Roman" w:hAnsi="Times New Roman" w:eastAsia="Times New Roman" w:cs="Times New Roman"/>
-          <w:b w:val="1"/>
-          <w:bCs w:val="1"/>
-          <w:noProof w:val="0"/>
-          <w:sz w:val="24"/>
-          <w:szCs w:val="24"/>
-          <w:lang w:val="sv-SE"/>
-        </w:rPr>
-        <w:t>Description</w:t>
-      </w:r>
-      <w:r>
-        <w:br/>
-      </w:r>
-      <w:r>
-        <w:rPr>
-          <w:rFonts w:ascii="Times New Roman" w:hAnsi="Times New Roman" w:eastAsia="Times New Roman" w:cs="Times New Roman"/>
-          <w:noProof w:val="0"/>
-          <w:sz w:val="24"/>
-          <w:szCs w:val="24"/>
-          <w:lang w:val="sv-SE"/>
-        </w:rPr>
-        <w:t xml:space="preserve"> Main control dashboard to control actuators and monitor sensors.</w:t>
-      </w:r>
-    </w:p>
-    <w:p>
-      <w:pPr>
-        <w:spacing w:before="0" w:beforeAutospacing="off" w:after="0" w:afterAutospacing="off"/>
-      </w:pPr>
-      <w:r>
-        <w:rPr>
-          <w:rFonts w:ascii="Times New Roman" w:hAnsi="Times New Roman" w:eastAsia="Times New Roman" w:cs="Times New Roman"/>
-          <w:noProof w:val="0"/>
-          <w:sz w:val="24"/>
-          <w:szCs w:val="24"/>
-          <w:lang w:val="sv-SE"/>
-        </w:rPr>
-        <w:t xml:space="preserve"> </w:t>
-      </w:r>
-    </w:p>
-    <w:p>
-      <w:pPr>
-        <w:spacing w:before="0" w:beforeAutospacing="off" w:after="0" w:afterAutospacing="off"/>
-      </w:pPr>
-      <w:r>
-        <w:rPr>
-          <w:rFonts w:ascii="Times New Roman" w:hAnsi="Times New Roman" w:eastAsia="Times New Roman" w:cs="Times New Roman"/>
-          <w:b w:val="1"/>
-          <w:bCs w:val="1"/>
-          <w:noProof w:val="0"/>
-          <w:sz w:val="24"/>
-          <w:szCs w:val="24"/>
-          <w:lang w:val="sv-SE"/>
-        </w:rPr>
-        <w:t>Components</w:t>
-      </w:r>
-    </w:p>
-    <w:p>
-      <w:pPr>
-        <w:spacing w:before="0" w:beforeAutospacing="off" w:after="0" w:afterAutospacing="off"/>
-      </w:pPr>
-      <w:r>
-        <w:rPr>
-          <w:rFonts w:ascii="Times New Roman" w:hAnsi="Times New Roman" w:eastAsia="Times New Roman" w:cs="Times New Roman"/>
-          <w:noProof w:val="0"/>
-          <w:sz w:val="24"/>
-          <w:szCs w:val="24"/>
-          <w:lang w:val="sv-SE"/>
-        </w:rPr>
-        <w:t>Actuators section:</w:t>
-      </w:r>
-    </w:p>
-    <w:p>
-      <w:pPr>
-        <w:spacing w:before="0" w:beforeAutospacing="off" w:after="0" w:afterAutospacing="off"/>
-        <w:ind w:left="720" w:right="0"/>
-      </w:pPr>
-      <w:r>
-        <w:rPr>
-          <w:rFonts w:ascii="Times New Roman" w:hAnsi="Times New Roman" w:eastAsia="Times New Roman" w:cs="Times New Roman"/>
-          <w:noProof w:val="0"/>
-          <w:sz w:val="24"/>
-          <w:szCs w:val="24"/>
-          <w:lang w:val="sv-SE"/>
-        </w:rPr>
-        <w:t>Servo toggles (Door/Window)</w:t>
-      </w:r>
-    </w:p>
-    <w:p>
-      <w:pPr>
-        <w:spacing w:before="0" w:beforeAutospacing="off" w:after="0" w:afterAutospacing="off"/>
-        <w:ind w:left="720" w:right="0"/>
-      </w:pPr>
-      <w:r>
-        <w:rPr>
-          <w:rFonts w:ascii="Times New Roman" w:hAnsi="Times New Roman" w:eastAsia="Times New Roman" w:cs="Times New Roman"/>
-          <w:noProof w:val="0"/>
-          <w:sz w:val="24"/>
-          <w:szCs w:val="24"/>
-          <w:lang w:val="sv-SE"/>
-        </w:rPr>
-        <w:t>Relay toggle</w:t>
-      </w:r>
-    </w:p>
-    <w:p>
-      <w:pPr>
-        <w:spacing w:before="0" w:beforeAutospacing="off" w:after="0" w:afterAutospacing="off"/>
-        <w:ind w:left="720" w:right="0"/>
-      </w:pPr>
-      <w:r>
-        <w:rPr>
-          <w:rFonts w:ascii="Times New Roman" w:hAnsi="Times New Roman" w:eastAsia="Times New Roman" w:cs="Times New Roman"/>
-          <w:noProof w:val="0"/>
-          <w:sz w:val="24"/>
-          <w:szCs w:val="24"/>
-          <w:lang w:val="sv-SE"/>
-        </w:rPr>
-        <w:t>White LED toggle</w:t>
-      </w:r>
-    </w:p>
-    <w:p>
-      <w:pPr>
-        <w:spacing w:before="0" w:beforeAutospacing="off" w:after="0" w:afterAutospacing="off"/>
-      </w:pPr>
-      <w:r>
-        <w:rPr>
-          <w:rFonts w:ascii="Times New Roman" w:hAnsi="Times New Roman" w:eastAsia="Times New Roman" w:cs="Times New Roman"/>
-          <w:noProof w:val="0"/>
-          <w:sz w:val="24"/>
-          <w:szCs w:val="24"/>
-          <w:lang w:val="sv-SE"/>
-        </w:rPr>
-        <w:t>Sensors section:</w:t>
-      </w:r>
-    </w:p>
-    <w:p>
-      <w:pPr>
-        <w:spacing w:before="0" w:beforeAutospacing="off" w:after="0" w:afterAutospacing="off"/>
-        <w:ind w:left="720" w:right="0"/>
-      </w:pPr>
-      <w:r>
-        <w:rPr>
-          <w:rFonts w:ascii="Times New Roman" w:hAnsi="Times New Roman" w:eastAsia="Times New Roman" w:cs="Times New Roman"/>
-          <w:noProof w:val="0"/>
-          <w:sz w:val="24"/>
-          <w:szCs w:val="24"/>
-          <w:lang w:val="sv-SE"/>
-        </w:rPr>
-        <w:t>PIR status (motion detected / not)</w:t>
-      </w:r>
-    </w:p>
-    <w:p>
-      <w:pPr>
-        <w:spacing w:before="0" w:beforeAutospacing="off" w:after="0" w:afterAutospacing="off"/>
-      </w:pPr>
-      <w:r>
-        <w:rPr>
-          <w:rFonts w:ascii="Times New Roman" w:hAnsi="Times New Roman" w:eastAsia="Times New Roman" w:cs="Times New Roman"/>
-          <w:noProof w:val="0"/>
-          <w:sz w:val="24"/>
-          <w:szCs w:val="24"/>
-          <w:lang w:val="sv-SE"/>
-        </w:rPr>
-        <w:t>UI widgets:</w:t>
-      </w:r>
-    </w:p>
-    <w:p>
-      <w:pPr>
-        <w:spacing w:before="0" w:beforeAutospacing="off" w:after="0" w:afterAutospacing="off"/>
-        <w:ind w:left="720" w:right="0"/>
-      </w:pPr>
-      <w:r>
-        <w:rPr>
-          <w:rFonts w:ascii="Times New Roman" w:hAnsi="Times New Roman" w:eastAsia="Times New Roman" w:cs="Times New Roman"/>
-          <w:noProof w:val="0"/>
-          <w:sz w:val="24"/>
-          <w:szCs w:val="24"/>
-          <w:lang w:val="sv-SE"/>
-        </w:rPr>
-        <w:t>Switch toggles</w:t>
-      </w:r>
-    </w:p>
-    <w:p>
-      <w:pPr>
-        <w:spacing w:before="0" w:beforeAutospacing="off" w:after="0" w:afterAutospacing="off"/>
-        <w:ind w:left="720" w:right="0"/>
-      </w:pPr>
-      <w:r>
-        <w:rPr>
-          <w:rFonts w:ascii="Times New Roman" w:hAnsi="Times New Roman" w:eastAsia="Times New Roman" w:cs="Times New Roman"/>
-          <w:noProof w:val="0"/>
-          <w:sz w:val="24"/>
-          <w:szCs w:val="24"/>
-          <w:lang w:val="sv-SE"/>
-        </w:rPr>
-        <w:t>Slider for LED brightness (Yellow LED)</w:t>
-      </w:r>
-    </w:p>
-    <w:p>
-      <w:pPr>
-        <w:spacing w:before="0" w:beforeAutospacing="off" w:after="0" w:afterAutospacing="off"/>
-        <w:ind w:left="720" w:right="0"/>
-      </w:pPr>
-      <w:r>
-        <w:rPr>
-          <w:rFonts w:ascii="Times New Roman" w:hAnsi="Times New Roman" w:eastAsia="Times New Roman" w:cs="Times New Roman"/>
-          <w:noProof w:val="0"/>
-          <w:sz w:val="24"/>
-          <w:szCs w:val="24"/>
-          <w:lang w:val="sv-SE"/>
-        </w:rPr>
-        <w:t>Slider for Fan speed</w:t>
-      </w:r>
-    </w:p>
-    <w:p>
-      <w:pPr>
-        <w:spacing w:before="0" w:beforeAutospacing="off" w:after="0" w:afterAutospacing="off"/>
-        <w:ind w:left="720" w:right="0"/>
-      </w:pPr>
-      <w:r>
-        <w:rPr>
-          <w:rFonts w:ascii="Times New Roman" w:hAnsi="Times New Roman" w:eastAsia="Times New Roman" w:cs="Times New Roman"/>
-          <w:noProof w:val="0"/>
-          <w:sz w:val="24"/>
-          <w:szCs w:val="24"/>
-          <w:lang w:val="sv-SE"/>
-        </w:rPr>
-        <w:t>Fan mode segmented control (Off/On + “Normal” mode badge)</w:t>
-      </w:r>
-    </w:p>
-    <w:p>
-      <w:pPr>
-        <w:spacing w:before="0" w:beforeAutospacing="off" w:after="0" w:afterAutospacing="off"/>
-      </w:pPr>
-      <w:r>
-        <w:rPr>
-          <w:rFonts w:ascii="Times New Roman" w:hAnsi="Times New Roman" w:eastAsia="Times New Roman" w:cs="Times New Roman"/>
-          <w:noProof w:val="0"/>
-          <w:sz w:val="24"/>
-          <w:szCs w:val="24"/>
-          <w:lang w:val="sv-SE"/>
-        </w:rPr>
-        <w:t xml:space="preserve"> </w:t>
-      </w:r>
-    </w:p>
-    <w:p>
-      <w:pPr>
-        <w:spacing w:before="0" w:beforeAutospacing="off" w:after="0" w:afterAutospacing="off"/>
-      </w:pPr>
-      <w:r>
-        <w:rPr>
-          <w:rFonts w:ascii="Times New Roman" w:hAnsi="Times New Roman" w:eastAsia="Times New Roman" w:cs="Times New Roman"/>
-          <w:b w:val="1"/>
-          <w:bCs w:val="1"/>
-          <w:noProof w:val="0"/>
-          <w:sz w:val="24"/>
-          <w:szCs w:val="24"/>
-          <w:lang w:val="sv-SE"/>
-        </w:rPr>
-        <w:t>Design</w:t>
-      </w:r>
-    </w:p>
-    <w:p>
-      <w:pPr>
-        <w:spacing w:before="0" w:beforeAutospacing="off" w:after="0" w:afterAutospacing="off"/>
-      </w:pPr>
-      <w:r>
-        <w:rPr>
-          <w:rFonts w:ascii="Times New Roman" w:hAnsi="Times New Roman" w:eastAsia="Times New Roman" w:cs="Times New Roman"/>
-          <w:noProof w:val="0"/>
-          <w:sz w:val="24"/>
-          <w:szCs w:val="24"/>
-          <w:lang w:val="sv-SE"/>
-        </w:rPr>
-        <w:t>Hub is the primary place for controlling actuators.</w:t>
-      </w:r>
-    </w:p>
-    <w:p>
-      <w:pPr>
-        <w:spacing w:before="0" w:beforeAutospacing="off" w:after="0" w:afterAutospacing="off"/>
-        <w:rPr>
-          <w:rFonts w:ascii="Times New Roman" w:hAnsi="Times New Roman" w:eastAsia="Times New Roman" w:cs="Times New Roman"/>
-          <w:noProof w:val="0"/>
-          <w:sz w:val="24"/>
-          <w:szCs w:val="24"/>
-          <w:lang w:val="sv-SE"/>
-        </w:rPr>
-      </w:pPr>
-      <w:r>
-        <w:rPr>
-          <w:rFonts w:ascii="Times New Roman" w:hAnsi="Times New Roman" w:eastAsia="Times New Roman" w:cs="Times New Roman"/>
-          <w:noProof w:val="0"/>
-          <w:sz w:val="24"/>
-          <w:szCs w:val="24"/>
-          <w:lang w:val="sv-SE"/>
-        </w:rPr>
-        <w:t xml:space="preserve">UI </w:t>
-      </w:r>
-      <w:r>
-        <w:rPr>
-          <w:rFonts w:ascii="Times New Roman" w:hAnsi="Times New Roman" w:eastAsia="Times New Roman" w:cs="Times New Roman"/>
-          <w:noProof w:val="0"/>
-          <w:sz w:val="24"/>
-          <w:szCs w:val="24"/>
-          <w:lang w:val="sv-SE"/>
-        </w:rPr>
-        <w:t>updates</w:t>
-      </w:r>
-      <w:r>
-        <w:rPr>
-          <w:rFonts w:ascii="Times New Roman" w:hAnsi="Times New Roman" w:eastAsia="Times New Roman" w:cs="Times New Roman"/>
-          <w:noProof w:val="0"/>
-          <w:sz w:val="24"/>
-          <w:szCs w:val="24"/>
-          <w:lang w:val="sv-SE"/>
-        </w:rPr>
-        <w:t xml:space="preserve"> must </w:t>
-      </w:r>
-      <w:r>
-        <w:rPr>
-          <w:rFonts w:ascii="Times New Roman" w:hAnsi="Times New Roman" w:eastAsia="Times New Roman" w:cs="Times New Roman"/>
-          <w:noProof w:val="0"/>
-          <w:sz w:val="24"/>
-          <w:szCs w:val="24"/>
-          <w:lang w:val="sv-SE"/>
-        </w:rPr>
-        <w:t>reflect</w:t>
-      </w:r>
-      <w:r>
-        <w:rPr>
-          <w:rFonts w:ascii="Times New Roman" w:hAnsi="Times New Roman" w:eastAsia="Times New Roman" w:cs="Times New Roman"/>
-          <w:noProof w:val="0"/>
-          <w:sz w:val="24"/>
-          <w:szCs w:val="24"/>
-          <w:lang w:val="sv-SE"/>
-        </w:rPr>
-        <w:t xml:space="preserve"> real </w:t>
-      </w:r>
-      <w:r>
-        <w:rPr>
-          <w:rFonts w:ascii="Times New Roman" w:hAnsi="Times New Roman" w:eastAsia="Times New Roman" w:cs="Times New Roman"/>
-          <w:noProof w:val="0"/>
-          <w:sz w:val="24"/>
-          <w:szCs w:val="24"/>
-          <w:lang w:val="sv-SE"/>
-        </w:rPr>
-        <w:t>device</w:t>
-      </w:r>
-      <w:r>
-        <w:rPr>
-          <w:rFonts w:ascii="Times New Roman" w:hAnsi="Times New Roman" w:eastAsia="Times New Roman" w:cs="Times New Roman"/>
-          <w:noProof w:val="0"/>
-          <w:sz w:val="24"/>
-          <w:szCs w:val="24"/>
-          <w:lang w:val="sv-SE"/>
-        </w:rPr>
-        <w:t xml:space="preserve"> </w:t>
-      </w:r>
-      <w:r>
-        <w:rPr>
-          <w:rFonts w:ascii="Times New Roman" w:hAnsi="Times New Roman" w:eastAsia="Times New Roman" w:cs="Times New Roman"/>
-          <w:noProof w:val="0"/>
-          <w:sz w:val="24"/>
-          <w:szCs w:val="24"/>
-          <w:lang w:val="sv-SE"/>
-        </w:rPr>
-        <w:t>state</w:t>
-      </w:r>
+        <w:rPr>
+          <w:rFonts w:ascii="Times New Roman" w:hAnsi="Times New Roman" w:eastAsia="Times New Roman" w:cs="Times New Roman"/>
+          <w:noProof w:val="0"/>
+          <w:sz w:val="24"/>
+          <w:szCs w:val="24"/>
+          <w:lang w:val="sv-SE"/>
+        </w:rPr>
+      </w:pPr>
     </w:p>
     <w:p>
       <w:pPr>
@@ -4011,6 +4623,176 @@
         <w:t>State Diagram</w:t>
       </w:r>
     </w:p>
+    <w:p>
+      <w:pPr>
+        <w:pStyle w:val="Normal"/>
+        <w:jc w:val="center"/>
+      </w:pPr>
+    </w:p>
+    <w:p>
+      <w:pPr>
+        <w:pStyle w:val="Normal"/>
+        <w:jc w:val="center"/>
+      </w:pPr>
+      <w:r>
+        <w:drawing>
+          <wp:inline wp14:editId="68135C72" wp14:anchorId="18D5C0DD">
+            <wp:extent cx="2466975" cy="5400732"/>
+            <wp:effectExtent l="0" t="0" r="0" b="0"/>
+            <wp:docPr id="1144892516" name="drawing"/>
+            <wp:cNvGraphicFramePr>
+              <a:graphicFrameLocks noChangeAspect="1"/>
+            </wp:cNvGraphicFramePr>
+            <a:graphic>
+              <a:graphicData xmlns:a="http://schemas.openxmlformats.org/drawingml/2006/main" uri="http://schemas.openxmlformats.org/drawingml/2006/picture">
+                <pic:pic xmlns:pic="http://schemas.openxmlformats.org/drawingml/2006/picture">
+                  <pic:nvPicPr>
+                    <pic:cNvPr id="1144892516" name="Picture 1144892516"/>
+                    <pic:cNvPicPr/>
+                  </pic:nvPicPr>
+                  <pic:blipFill>
+                    <a:blip xmlns:r="http://schemas.openxmlformats.org/officeDocument/2006/relationships" r:embed="rId2024393149">
+                      <a:extLst>
+                        <a:ext uri="{28A0092B-C50C-407E-A947-70E740481C1C}">
+                          <a14:useLocalDpi xmlns:a14="http://schemas.microsoft.com/office/drawing/2010/main"/>
+                        </a:ext>
+                      </a:extLst>
+                    </a:blip>
+                    <a:srcRect l="0" t="2975" r="0" b="3305"/>
+                    <a:stretch>
+                      <a:fillRect/>
+                    </a:stretch>
+                  </pic:blipFill>
+                  <pic:spPr>
+                    <a:xfrm rot="0">
+                      <a:off x="0" y="0"/>
+                      <a:ext cx="2466975" cy="5400732"/>
+                    </a:xfrm>
+                    <a:prstGeom prst="rect">
+                      <a:avLst/>
+                    </a:prstGeom>
+                  </pic:spPr>
+                </pic:pic>
+              </a:graphicData>
+            </a:graphic>
+          </wp:inline>
+        </w:drawing>
+      </w:r>
+    </w:p>
+    <w:p>
+      <w:pPr>
+        <w:pStyle w:val="Normal"/>
+        <w:jc w:val="center"/>
+      </w:pPr>
+      <w:r>
+        <w:rPr/>
+        <w:t xml:space="preserve">Mobile </w:t>
+      </w:r>
+      <w:r>
+        <w:rPr/>
+        <w:t>App</w:t>
+      </w:r>
+      <w:r>
+        <w:rPr/>
+        <w:t xml:space="preserve"> </w:t>
+      </w:r>
+      <w:r>
+        <w:rPr/>
+        <w:t>Preview</w:t>
+      </w:r>
+      <w:r>
+        <w:rPr/>
+        <w:t xml:space="preserve"> – </w:t>
+      </w:r>
+      <w:r>
+        <w:rPr/>
+        <w:t>Signup</w:t>
+      </w:r>
+      <w:r>
+        <w:rPr/>
+        <w:t xml:space="preserve"> </w:t>
+      </w:r>
+      <w:r>
+        <w:rPr/>
+        <w:t>Screen</w:t>
+      </w:r>
+    </w:p>
+    <w:p>
+      <w:pPr>
+        <w:pStyle w:val="Normal"/>
+        <w:jc w:val="center"/>
+      </w:pPr>
+      <w:r>
+        <w:drawing>
+          <wp:inline wp14:editId="4F3FAFAF" wp14:anchorId="0C50C18A">
+            <wp:extent cx="2466975" cy="5467406"/>
+            <wp:effectExtent l="0" t="0" r="0" b="0"/>
+            <wp:docPr id="316724030" name="drawing"/>
+            <wp:cNvGraphicFramePr>
+              <a:graphicFrameLocks noChangeAspect="1"/>
+            </wp:cNvGraphicFramePr>
+            <a:graphic>
+              <a:graphicData xmlns:a="http://schemas.openxmlformats.org/drawingml/2006/main" uri="http://schemas.openxmlformats.org/drawingml/2006/picture">
+                <pic:pic xmlns:pic="http://schemas.openxmlformats.org/drawingml/2006/picture">
+                  <pic:nvPicPr>
+                    <pic:cNvPr id="316724030" name="Picture 316724030"/>
+                    <pic:cNvPicPr/>
+                  </pic:nvPicPr>
+                  <pic:blipFill>
+                    <a:blip xmlns:r="http://schemas.openxmlformats.org/officeDocument/2006/relationships" r:embed="rId1563150747">
+                      <a:extLst>
+                        <a:ext uri="{28A0092B-C50C-407E-A947-70E740481C1C}">
+                          <a14:useLocalDpi xmlns:a14="http://schemas.microsoft.com/office/drawing/2010/main"/>
+                        </a:ext>
+                      </a:extLst>
+                    </a:blip>
+                    <a:srcRect l="0" t="2809" r="0" b="2314"/>
+                    <a:stretch>
+                      <a:fillRect/>
+                    </a:stretch>
+                  </pic:blipFill>
+                  <pic:spPr>
+                    <a:xfrm rot="0">
+                      <a:off x="0" y="0"/>
+                      <a:ext cx="2466975" cy="5467406"/>
+                    </a:xfrm>
+                    <a:prstGeom prst="rect">
+                      <a:avLst/>
+                    </a:prstGeom>
+                  </pic:spPr>
+                </pic:pic>
+              </a:graphicData>
+            </a:graphic>
+          </wp:inline>
+        </w:drawing>
+      </w:r>
+    </w:p>
+    <w:p>
+      <w:pPr>
+        <w:pStyle w:val="Normal"/>
+        <w:jc w:val="center"/>
+      </w:pPr>
+      <w:r>
+        <w:rPr/>
+        <w:t xml:space="preserve">Mobile </w:t>
+      </w:r>
+      <w:r>
+        <w:rPr/>
+        <w:t>App</w:t>
+      </w:r>
+      <w:r>
+        <w:rPr/>
+        <w:t xml:space="preserve"> </w:t>
+      </w:r>
+      <w:r>
+        <w:rPr/>
+        <w:t>Preview</w:t>
+      </w:r>
+      <w:r>
+        <w:rPr/>
+        <w:t xml:space="preserve"> – Login Screen</w:t>
+      </w:r>
+    </w:p>
     <w:p xmlns:wp14="http://schemas.microsoft.com/office/word/2010/wordml" wp14:textId="7D7D468D">
       <w:pPr/>
       <w:r>
@@ -4327,7 +5109,7 @@
       </w:pPr>
       <w:r>
         <w:drawing>
-          <wp:inline wp14:editId="4F212EDC" wp14:anchorId="6F59144A">
+          <wp:inline wp14:editId="0441A694" wp14:anchorId="6F59144A">
             <wp:extent cx="5762625" cy="2505075"/>
             <wp:effectExtent l="0" t="0" r="0" b="0"/>
             <wp:docPr id="606144176" name="drawing"/>
@@ -4371,6 +5153,94 @@
       <w:r>
         <w:rPr/>
         <w:t>State Diagram</w:t>
+      </w:r>
+    </w:p>
+    <w:p>
+      <w:r>
+        <w:br w:type="page"/>
+      </w:r>
+    </w:p>
+    <w:p>
+      <w:pPr>
+        <w:pStyle w:val="Normal"/>
+        <w:jc w:val="center"/>
+      </w:pPr>
+      <w:r>
+        <w:drawing>
+          <wp:inline wp14:editId="508FFA49" wp14:anchorId="372CA80C">
+            <wp:extent cx="2600325" cy="5762625"/>
+            <wp:effectExtent l="0" t="0" r="0" b="0"/>
+            <wp:docPr id="2142408529" name="drawing"/>
+            <wp:cNvGraphicFramePr>
+              <a:graphicFrameLocks noChangeAspect="1"/>
+            </wp:cNvGraphicFramePr>
+            <a:graphic>
+              <a:graphicData xmlns:a="http://schemas.openxmlformats.org/drawingml/2006/main" uri="http://schemas.openxmlformats.org/drawingml/2006/picture">
+                <pic:pic xmlns:pic="http://schemas.openxmlformats.org/drawingml/2006/picture">
+                  <pic:nvPicPr>
+                    <pic:cNvPr id="2142408529" name="Picture 2142408529"/>
+                    <pic:cNvPicPr/>
+                  </pic:nvPicPr>
+                  <pic:blipFill>
+                    <a:blip xmlns:r="http://schemas.openxmlformats.org/officeDocument/2006/relationships" r:embed="rId1732439141">
+                      <a:extLst>
+                        <a:ext uri="{28A0092B-C50C-407E-A947-70E740481C1C}">
+                          <a14:useLocalDpi xmlns:a14="http://schemas.microsoft.com/office/drawing/2010/main"/>
+                        </a:ext>
+                      </a:extLst>
+                    </a:blip>
+                    <a:stretch>
+                      <a:fillRect/>
+                    </a:stretch>
+                  </pic:blipFill>
+                  <pic:spPr>
+                    <a:xfrm>
+                      <a:off x="0" y="0"/>
+                      <a:ext cx="2600325" cy="5762625"/>
+                    </a:xfrm>
+                    <a:prstGeom prst="rect">
+                      <a:avLst/>
+                    </a:prstGeom>
+                  </pic:spPr>
+                </pic:pic>
+              </a:graphicData>
+            </a:graphic>
+          </wp:inline>
+        </w:drawing>
+      </w:r>
+    </w:p>
+    <w:p>
+      <w:pPr>
+        <w:pStyle w:val="Normal"/>
+        <w:suppressLineNumbers w:val="0"/>
+        <w:bidi w:val="0"/>
+        <w:spacing w:before="0" w:beforeAutospacing="off" w:after="0" w:afterAutospacing="off" w:line="259" w:lineRule="auto"/>
+        <w:ind w:left="0" w:right="0"/>
+        <w:jc w:val="center"/>
+      </w:pPr>
+      <w:r>
+        <w:rPr/>
+        <w:t xml:space="preserve">Mobile </w:t>
+      </w:r>
+      <w:r>
+        <w:rPr/>
+        <w:t>App</w:t>
+      </w:r>
+      <w:r>
+        <w:rPr/>
+        <w:t xml:space="preserve"> </w:t>
+      </w:r>
+      <w:r>
+        <w:rPr/>
+        <w:t>Preview</w:t>
+      </w:r>
+      <w:r>
+        <w:rPr/>
+        <w:t xml:space="preserve"> of Device </w:t>
+      </w:r>
+      <w:r>
+        <w:rPr/>
+        <w:t>Hub</w:t>
       </w:r>
     </w:p>
     <w:p xmlns:wp14="http://schemas.microsoft.com/office/word/2010/wordml" wp14:textId="4C6CC8FB">
@@ -4688,6 +5558,36 @@
         <w:jc w:val="center"/>
       </w:pPr>
     </w:p>
+    <w:p>
+      <w:pPr>
+        <w:pStyle w:val="Normal"/>
+        <w:jc w:val="center"/>
+      </w:pPr>
+    </w:p>
+    <w:p>
+      <w:pPr>
+        <w:pStyle w:val="Normal"/>
+        <w:jc w:val="center"/>
+      </w:pPr>
+    </w:p>
+    <w:p>
+      <w:pPr>
+        <w:pStyle w:val="Normal"/>
+        <w:jc w:val="center"/>
+      </w:pPr>
+    </w:p>
+    <w:p>
+      <w:pPr>
+        <w:pStyle w:val="Normal"/>
+        <w:jc w:val="center"/>
+      </w:pPr>
+    </w:p>
+    <w:p>
+      <w:pPr>
+        <w:pStyle w:val="Normal"/>
+        <w:jc w:val="center"/>
+      </w:pPr>
+    </w:p>
     <w:sectPr>
       <w:pgSz w:w="11906" w:h="16838" w:orient="portrait"/>
       <w:pgMar w:top="1417" w:right="1417" w:bottom="1417" w:left="1417" w:header="708" w:footer="708" w:gutter="0"/>
@@ -4734,6 +5634,816 @@
     </w:p>
   </w:footnote>
 </w:footnotes>
+</file>
+
+<file path=word/numbering.xml><?xml version="1.0" encoding="utf-8"?>
+<w:numbering xmlns:w="http://schemas.openxmlformats.org/wordprocessingml/2006/main">
+  <w:abstractNum xmlns:w="http://schemas.openxmlformats.org/wordprocessingml/2006/main" w:abstractNumId="7">
+    <w:nsid w:val="33315b27"/>
+    <w:multiLevelType xmlns:w="http://schemas.openxmlformats.org/wordprocessingml/2006/main" w:val="hybridMultilevel"/>
+    <w:lvl xmlns:w="http://schemas.openxmlformats.org/wordprocessingml/2006/main" w:ilvl="0">
+      <w:start w:val="1"/>
+      <w:numFmt w:val="bullet"/>
+      <w:lvlText w:val=""/>
+      <w:lvlJc w:val="left"/>
+      <w:pPr>
+        <w:ind w:left="720" w:hanging="360"/>
+      </w:pPr>
+      <w:rPr>
+        <w:rFonts w:hint="default" w:ascii="Symbol" w:hAnsi="Symbol"/>
+      </w:rPr>
+    </w:lvl>
+    <w:lvl xmlns:w="http://schemas.openxmlformats.org/wordprocessingml/2006/main" w:ilvl="1">
+      <w:start w:val="1"/>
+      <w:numFmt w:val="bullet"/>
+      <w:lvlText w:val="o"/>
+      <w:lvlJc w:val="left"/>
+      <w:pPr>
+        <w:ind w:left="1440" w:hanging="360"/>
+      </w:pPr>
+      <w:rPr>
+        <w:rFonts w:hint="default" w:ascii="Courier New" w:hAnsi="Courier New"/>
+      </w:rPr>
+    </w:lvl>
+    <w:lvl xmlns:w="http://schemas.openxmlformats.org/wordprocessingml/2006/main" w:ilvl="2">
+      <w:start w:val="1"/>
+      <w:numFmt w:val="bullet"/>
+      <w:lvlText w:val=""/>
+      <w:lvlJc w:val="left"/>
+      <w:pPr>
+        <w:ind w:left="2160" w:hanging="360"/>
+      </w:pPr>
+      <w:rPr>
+        <w:rFonts w:hint="default" w:ascii="Wingdings" w:hAnsi="Wingdings"/>
+      </w:rPr>
+    </w:lvl>
+    <w:lvl xmlns:w="http://schemas.openxmlformats.org/wordprocessingml/2006/main" w:ilvl="3">
+      <w:start w:val="1"/>
+      <w:numFmt w:val="bullet"/>
+      <w:lvlText w:val=""/>
+      <w:lvlJc w:val="left"/>
+      <w:pPr>
+        <w:ind w:left="2880" w:hanging="360"/>
+      </w:pPr>
+      <w:rPr>
+        <w:rFonts w:hint="default" w:ascii="Symbol" w:hAnsi="Symbol"/>
+      </w:rPr>
+    </w:lvl>
+    <w:lvl xmlns:w="http://schemas.openxmlformats.org/wordprocessingml/2006/main" w:ilvl="4">
+      <w:start w:val="1"/>
+      <w:numFmt w:val="bullet"/>
+      <w:lvlText w:val="o"/>
+      <w:lvlJc w:val="left"/>
+      <w:pPr>
+        <w:ind w:left="3600" w:hanging="360"/>
+      </w:pPr>
+      <w:rPr>
+        <w:rFonts w:hint="default" w:ascii="Courier New" w:hAnsi="Courier New"/>
+      </w:rPr>
+    </w:lvl>
+    <w:lvl xmlns:w="http://schemas.openxmlformats.org/wordprocessingml/2006/main" w:ilvl="5">
+      <w:start w:val="1"/>
+      <w:numFmt w:val="bullet"/>
+      <w:lvlText w:val=""/>
+      <w:lvlJc w:val="left"/>
+      <w:pPr>
+        <w:ind w:left="4320" w:hanging="360"/>
+      </w:pPr>
+      <w:rPr>
+        <w:rFonts w:hint="default" w:ascii="Wingdings" w:hAnsi="Wingdings"/>
+      </w:rPr>
+    </w:lvl>
+    <w:lvl xmlns:w="http://schemas.openxmlformats.org/wordprocessingml/2006/main" w:ilvl="6">
+      <w:start w:val="1"/>
+      <w:numFmt w:val="bullet"/>
+      <w:lvlText w:val=""/>
+      <w:lvlJc w:val="left"/>
+      <w:pPr>
+        <w:ind w:left="5040" w:hanging="360"/>
+      </w:pPr>
+      <w:rPr>
+        <w:rFonts w:hint="default" w:ascii="Symbol" w:hAnsi="Symbol"/>
+      </w:rPr>
+    </w:lvl>
+    <w:lvl xmlns:w="http://schemas.openxmlformats.org/wordprocessingml/2006/main" w:ilvl="7">
+      <w:start w:val="1"/>
+      <w:numFmt w:val="bullet"/>
+      <w:lvlText w:val="o"/>
+      <w:lvlJc w:val="left"/>
+      <w:pPr>
+        <w:ind w:left="5760" w:hanging="360"/>
+      </w:pPr>
+      <w:rPr>
+        <w:rFonts w:hint="default" w:ascii="Courier New" w:hAnsi="Courier New"/>
+      </w:rPr>
+    </w:lvl>
+    <w:lvl xmlns:w="http://schemas.openxmlformats.org/wordprocessingml/2006/main" w:ilvl="8">
+      <w:start w:val="1"/>
+      <w:numFmt w:val="bullet"/>
+      <w:lvlText w:val=""/>
+      <w:lvlJc w:val="left"/>
+      <w:pPr>
+        <w:ind w:left="6480" w:hanging="360"/>
+      </w:pPr>
+      <w:rPr>
+        <w:rFonts w:hint="default" w:ascii="Wingdings" w:hAnsi="Wingdings"/>
+      </w:rPr>
+    </w:lvl>
+  </w:abstractNum>
+  <w:abstractNum xmlns:w="http://schemas.openxmlformats.org/wordprocessingml/2006/main" w:abstractNumId="6">
+    <w:nsid w:val="4fd4e9a0"/>
+    <w:multiLevelType xmlns:w="http://schemas.openxmlformats.org/wordprocessingml/2006/main" w:val="hybridMultilevel"/>
+    <w:lvl xmlns:w="http://schemas.openxmlformats.org/wordprocessingml/2006/main" w:ilvl="0">
+      <w:start w:val="1"/>
+      <w:numFmt w:val="bullet"/>
+      <w:lvlText w:val=""/>
+      <w:lvlJc w:val="left"/>
+      <w:pPr>
+        <w:ind w:left="720" w:hanging="360"/>
+      </w:pPr>
+      <w:rPr>
+        <w:rFonts w:hint="default" w:ascii="Symbol" w:hAnsi="Symbol"/>
+      </w:rPr>
+    </w:lvl>
+    <w:lvl xmlns:w="http://schemas.openxmlformats.org/wordprocessingml/2006/main" w:ilvl="1">
+      <w:start w:val="1"/>
+      <w:numFmt w:val="bullet"/>
+      <w:lvlText w:val="o"/>
+      <w:lvlJc w:val="left"/>
+      <w:pPr>
+        <w:ind w:left="1440" w:hanging="360"/>
+      </w:pPr>
+      <w:rPr>
+        <w:rFonts w:hint="default" w:ascii="Courier New" w:hAnsi="Courier New"/>
+      </w:rPr>
+    </w:lvl>
+    <w:lvl xmlns:w="http://schemas.openxmlformats.org/wordprocessingml/2006/main" w:ilvl="2">
+      <w:start w:val="1"/>
+      <w:numFmt w:val="bullet"/>
+      <w:lvlText w:val=""/>
+      <w:lvlJc w:val="left"/>
+      <w:pPr>
+        <w:ind w:left="2160" w:hanging="360"/>
+      </w:pPr>
+      <w:rPr>
+        <w:rFonts w:hint="default" w:ascii="Wingdings" w:hAnsi="Wingdings"/>
+      </w:rPr>
+    </w:lvl>
+    <w:lvl xmlns:w="http://schemas.openxmlformats.org/wordprocessingml/2006/main" w:ilvl="3">
+      <w:start w:val="1"/>
+      <w:numFmt w:val="bullet"/>
+      <w:lvlText w:val=""/>
+      <w:lvlJc w:val="left"/>
+      <w:pPr>
+        <w:ind w:left="2880" w:hanging="360"/>
+      </w:pPr>
+      <w:rPr>
+        <w:rFonts w:hint="default" w:ascii="Symbol" w:hAnsi="Symbol"/>
+      </w:rPr>
+    </w:lvl>
+    <w:lvl xmlns:w="http://schemas.openxmlformats.org/wordprocessingml/2006/main" w:ilvl="4">
+      <w:start w:val="1"/>
+      <w:numFmt w:val="bullet"/>
+      <w:lvlText w:val="o"/>
+      <w:lvlJc w:val="left"/>
+      <w:pPr>
+        <w:ind w:left="3600" w:hanging="360"/>
+      </w:pPr>
+      <w:rPr>
+        <w:rFonts w:hint="default" w:ascii="Courier New" w:hAnsi="Courier New"/>
+      </w:rPr>
+    </w:lvl>
+    <w:lvl xmlns:w="http://schemas.openxmlformats.org/wordprocessingml/2006/main" w:ilvl="5">
+      <w:start w:val="1"/>
+      <w:numFmt w:val="bullet"/>
+      <w:lvlText w:val=""/>
+      <w:lvlJc w:val="left"/>
+      <w:pPr>
+        <w:ind w:left="4320" w:hanging="360"/>
+      </w:pPr>
+      <w:rPr>
+        <w:rFonts w:hint="default" w:ascii="Wingdings" w:hAnsi="Wingdings"/>
+      </w:rPr>
+    </w:lvl>
+    <w:lvl xmlns:w="http://schemas.openxmlformats.org/wordprocessingml/2006/main" w:ilvl="6">
+      <w:start w:val="1"/>
+      <w:numFmt w:val="bullet"/>
+      <w:lvlText w:val=""/>
+      <w:lvlJc w:val="left"/>
+      <w:pPr>
+        <w:ind w:left="5040" w:hanging="360"/>
+      </w:pPr>
+      <w:rPr>
+        <w:rFonts w:hint="default" w:ascii="Symbol" w:hAnsi="Symbol"/>
+      </w:rPr>
+    </w:lvl>
+    <w:lvl xmlns:w="http://schemas.openxmlformats.org/wordprocessingml/2006/main" w:ilvl="7">
+      <w:start w:val="1"/>
+      <w:numFmt w:val="bullet"/>
+      <w:lvlText w:val="o"/>
+      <w:lvlJc w:val="left"/>
+      <w:pPr>
+        <w:ind w:left="5760" w:hanging="360"/>
+      </w:pPr>
+      <w:rPr>
+        <w:rFonts w:hint="default" w:ascii="Courier New" w:hAnsi="Courier New"/>
+      </w:rPr>
+    </w:lvl>
+    <w:lvl xmlns:w="http://schemas.openxmlformats.org/wordprocessingml/2006/main" w:ilvl="8">
+      <w:start w:val="1"/>
+      <w:numFmt w:val="bullet"/>
+      <w:lvlText w:val=""/>
+      <w:lvlJc w:val="left"/>
+      <w:pPr>
+        <w:ind w:left="6480" w:hanging="360"/>
+      </w:pPr>
+      <w:rPr>
+        <w:rFonts w:hint="default" w:ascii="Wingdings" w:hAnsi="Wingdings"/>
+      </w:rPr>
+    </w:lvl>
+  </w:abstractNum>
+  <w:abstractNum xmlns:w="http://schemas.openxmlformats.org/wordprocessingml/2006/main" w:abstractNumId="5">
+    <w:nsid w:val="53568772"/>
+    <w:multiLevelType xmlns:w="http://schemas.openxmlformats.org/wordprocessingml/2006/main" w:val="hybridMultilevel"/>
+    <w:lvl xmlns:w="http://schemas.openxmlformats.org/wordprocessingml/2006/main" w:ilvl="0">
+      <w:start w:val="1"/>
+      <w:numFmt w:val="bullet"/>
+      <w:lvlText w:val=""/>
+      <w:lvlJc w:val="left"/>
+      <w:pPr>
+        <w:ind w:left="720" w:hanging="360"/>
+      </w:pPr>
+      <w:rPr>
+        <w:rFonts w:hint="default" w:ascii="Symbol" w:hAnsi="Symbol"/>
+      </w:rPr>
+    </w:lvl>
+    <w:lvl xmlns:w="http://schemas.openxmlformats.org/wordprocessingml/2006/main" w:ilvl="1">
+      <w:start w:val="1"/>
+      <w:numFmt w:val="bullet"/>
+      <w:lvlText w:val="o"/>
+      <w:lvlJc w:val="left"/>
+      <w:pPr>
+        <w:ind w:left="1440" w:hanging="360"/>
+      </w:pPr>
+      <w:rPr>
+        <w:rFonts w:hint="default" w:ascii="Courier New" w:hAnsi="Courier New"/>
+      </w:rPr>
+    </w:lvl>
+    <w:lvl xmlns:w="http://schemas.openxmlformats.org/wordprocessingml/2006/main" w:ilvl="2">
+      <w:start w:val="1"/>
+      <w:numFmt w:val="bullet"/>
+      <w:lvlText w:val=""/>
+      <w:lvlJc w:val="left"/>
+      <w:pPr>
+        <w:ind w:left="2160" w:hanging="360"/>
+      </w:pPr>
+      <w:rPr>
+        <w:rFonts w:hint="default" w:ascii="Wingdings" w:hAnsi="Wingdings"/>
+      </w:rPr>
+    </w:lvl>
+    <w:lvl xmlns:w="http://schemas.openxmlformats.org/wordprocessingml/2006/main" w:ilvl="3">
+      <w:start w:val="1"/>
+      <w:numFmt w:val="bullet"/>
+      <w:lvlText w:val=""/>
+      <w:lvlJc w:val="left"/>
+      <w:pPr>
+        <w:ind w:left="2880" w:hanging="360"/>
+      </w:pPr>
+      <w:rPr>
+        <w:rFonts w:hint="default" w:ascii="Symbol" w:hAnsi="Symbol"/>
+      </w:rPr>
+    </w:lvl>
+    <w:lvl xmlns:w="http://schemas.openxmlformats.org/wordprocessingml/2006/main" w:ilvl="4">
+      <w:start w:val="1"/>
+      <w:numFmt w:val="bullet"/>
+      <w:lvlText w:val="o"/>
+      <w:lvlJc w:val="left"/>
+      <w:pPr>
+        <w:ind w:left="3600" w:hanging="360"/>
+      </w:pPr>
+      <w:rPr>
+        <w:rFonts w:hint="default" w:ascii="Courier New" w:hAnsi="Courier New"/>
+      </w:rPr>
+    </w:lvl>
+    <w:lvl xmlns:w="http://schemas.openxmlformats.org/wordprocessingml/2006/main" w:ilvl="5">
+      <w:start w:val="1"/>
+      <w:numFmt w:val="bullet"/>
+      <w:lvlText w:val=""/>
+      <w:lvlJc w:val="left"/>
+      <w:pPr>
+        <w:ind w:left="4320" w:hanging="360"/>
+      </w:pPr>
+      <w:rPr>
+        <w:rFonts w:hint="default" w:ascii="Wingdings" w:hAnsi="Wingdings"/>
+      </w:rPr>
+    </w:lvl>
+    <w:lvl xmlns:w="http://schemas.openxmlformats.org/wordprocessingml/2006/main" w:ilvl="6">
+      <w:start w:val="1"/>
+      <w:numFmt w:val="bullet"/>
+      <w:lvlText w:val=""/>
+      <w:lvlJc w:val="left"/>
+      <w:pPr>
+        <w:ind w:left="5040" w:hanging="360"/>
+      </w:pPr>
+      <w:rPr>
+        <w:rFonts w:hint="default" w:ascii="Symbol" w:hAnsi="Symbol"/>
+      </w:rPr>
+    </w:lvl>
+    <w:lvl xmlns:w="http://schemas.openxmlformats.org/wordprocessingml/2006/main" w:ilvl="7">
+      <w:start w:val="1"/>
+      <w:numFmt w:val="bullet"/>
+      <w:lvlText w:val="o"/>
+      <w:lvlJc w:val="left"/>
+      <w:pPr>
+        <w:ind w:left="5760" w:hanging="360"/>
+      </w:pPr>
+      <w:rPr>
+        <w:rFonts w:hint="default" w:ascii="Courier New" w:hAnsi="Courier New"/>
+      </w:rPr>
+    </w:lvl>
+    <w:lvl xmlns:w="http://schemas.openxmlformats.org/wordprocessingml/2006/main" w:ilvl="8">
+      <w:start w:val="1"/>
+      <w:numFmt w:val="bullet"/>
+      <w:lvlText w:val=""/>
+      <w:lvlJc w:val="left"/>
+      <w:pPr>
+        <w:ind w:left="6480" w:hanging="360"/>
+      </w:pPr>
+      <w:rPr>
+        <w:rFonts w:hint="default" w:ascii="Wingdings" w:hAnsi="Wingdings"/>
+      </w:rPr>
+    </w:lvl>
+  </w:abstractNum>
+  <w:abstractNum xmlns:w="http://schemas.openxmlformats.org/wordprocessingml/2006/main" w:abstractNumId="4">
+    <w:nsid w:val="5dc65416"/>
+    <w:multiLevelType xmlns:w="http://schemas.openxmlformats.org/wordprocessingml/2006/main" w:val="hybridMultilevel"/>
+    <w:lvl xmlns:w="http://schemas.openxmlformats.org/wordprocessingml/2006/main" w:ilvl="0">
+      <w:start w:val="1"/>
+      <w:numFmt w:val="bullet"/>
+      <w:lvlText w:val=""/>
+      <w:lvlJc w:val="left"/>
+      <w:pPr>
+        <w:ind w:left="720" w:hanging="360"/>
+      </w:pPr>
+      <w:rPr>
+        <w:rFonts w:hint="default" w:ascii="Symbol" w:hAnsi="Symbol"/>
+      </w:rPr>
+    </w:lvl>
+    <w:lvl xmlns:w="http://schemas.openxmlformats.org/wordprocessingml/2006/main" w:ilvl="1">
+      <w:start w:val="1"/>
+      <w:numFmt w:val="bullet"/>
+      <w:lvlText w:val="o"/>
+      <w:lvlJc w:val="left"/>
+      <w:pPr>
+        <w:ind w:left="1440" w:hanging="360"/>
+      </w:pPr>
+      <w:rPr>
+        <w:rFonts w:hint="default" w:ascii="Courier New" w:hAnsi="Courier New"/>
+      </w:rPr>
+    </w:lvl>
+    <w:lvl xmlns:w="http://schemas.openxmlformats.org/wordprocessingml/2006/main" w:ilvl="2">
+      <w:start w:val="1"/>
+      <w:numFmt w:val="bullet"/>
+      <w:lvlText w:val=""/>
+      <w:lvlJc w:val="left"/>
+      <w:pPr>
+        <w:ind w:left="2160" w:hanging="360"/>
+      </w:pPr>
+      <w:rPr>
+        <w:rFonts w:hint="default" w:ascii="Wingdings" w:hAnsi="Wingdings"/>
+      </w:rPr>
+    </w:lvl>
+    <w:lvl xmlns:w="http://schemas.openxmlformats.org/wordprocessingml/2006/main" w:ilvl="3">
+      <w:start w:val="1"/>
+      <w:numFmt w:val="bullet"/>
+      <w:lvlText w:val=""/>
+      <w:lvlJc w:val="left"/>
+      <w:pPr>
+        <w:ind w:left="2880" w:hanging="360"/>
+      </w:pPr>
+      <w:rPr>
+        <w:rFonts w:hint="default" w:ascii="Symbol" w:hAnsi="Symbol"/>
+      </w:rPr>
+    </w:lvl>
+    <w:lvl xmlns:w="http://schemas.openxmlformats.org/wordprocessingml/2006/main" w:ilvl="4">
+      <w:start w:val="1"/>
+      <w:numFmt w:val="bullet"/>
+      <w:lvlText w:val="o"/>
+      <w:lvlJc w:val="left"/>
+      <w:pPr>
+        <w:ind w:left="3600" w:hanging="360"/>
+      </w:pPr>
+      <w:rPr>
+        <w:rFonts w:hint="default" w:ascii="Courier New" w:hAnsi="Courier New"/>
+      </w:rPr>
+    </w:lvl>
+    <w:lvl xmlns:w="http://schemas.openxmlformats.org/wordprocessingml/2006/main" w:ilvl="5">
+      <w:start w:val="1"/>
+      <w:numFmt w:val="bullet"/>
+      <w:lvlText w:val=""/>
+      <w:lvlJc w:val="left"/>
+      <w:pPr>
+        <w:ind w:left="4320" w:hanging="360"/>
+      </w:pPr>
+      <w:rPr>
+        <w:rFonts w:hint="default" w:ascii="Wingdings" w:hAnsi="Wingdings"/>
+      </w:rPr>
+    </w:lvl>
+    <w:lvl xmlns:w="http://schemas.openxmlformats.org/wordprocessingml/2006/main" w:ilvl="6">
+      <w:start w:val="1"/>
+      <w:numFmt w:val="bullet"/>
+      <w:lvlText w:val=""/>
+      <w:lvlJc w:val="left"/>
+      <w:pPr>
+        <w:ind w:left="5040" w:hanging="360"/>
+      </w:pPr>
+      <w:rPr>
+        <w:rFonts w:hint="default" w:ascii="Symbol" w:hAnsi="Symbol"/>
+      </w:rPr>
+    </w:lvl>
+    <w:lvl xmlns:w="http://schemas.openxmlformats.org/wordprocessingml/2006/main" w:ilvl="7">
+      <w:start w:val="1"/>
+      <w:numFmt w:val="bullet"/>
+      <w:lvlText w:val="o"/>
+      <w:lvlJc w:val="left"/>
+      <w:pPr>
+        <w:ind w:left="5760" w:hanging="360"/>
+      </w:pPr>
+      <w:rPr>
+        <w:rFonts w:hint="default" w:ascii="Courier New" w:hAnsi="Courier New"/>
+      </w:rPr>
+    </w:lvl>
+    <w:lvl xmlns:w="http://schemas.openxmlformats.org/wordprocessingml/2006/main" w:ilvl="8">
+      <w:start w:val="1"/>
+      <w:numFmt w:val="bullet"/>
+      <w:lvlText w:val=""/>
+      <w:lvlJc w:val="left"/>
+      <w:pPr>
+        <w:ind w:left="6480" w:hanging="360"/>
+      </w:pPr>
+      <w:rPr>
+        <w:rFonts w:hint="default" w:ascii="Wingdings" w:hAnsi="Wingdings"/>
+      </w:rPr>
+    </w:lvl>
+  </w:abstractNum>
+  <w:abstractNum xmlns:w="http://schemas.openxmlformats.org/wordprocessingml/2006/main" w:abstractNumId="3">
+    <w:nsid w:val="5c9b74ec"/>
+    <w:multiLevelType xmlns:w="http://schemas.openxmlformats.org/wordprocessingml/2006/main" w:val="hybridMultilevel"/>
+    <w:lvl xmlns:w="http://schemas.openxmlformats.org/wordprocessingml/2006/main" w:ilvl="0">
+      <w:start w:val="1"/>
+      <w:numFmt w:val="bullet"/>
+      <w:lvlText w:val=""/>
+      <w:lvlJc w:val="left"/>
+      <w:pPr>
+        <w:ind w:left="720" w:hanging="360"/>
+      </w:pPr>
+      <w:rPr>
+        <w:rFonts w:hint="default" w:ascii="Symbol" w:hAnsi="Symbol"/>
+      </w:rPr>
+    </w:lvl>
+    <w:lvl xmlns:w="http://schemas.openxmlformats.org/wordprocessingml/2006/main" w:ilvl="1">
+      <w:start w:val="1"/>
+      <w:numFmt w:val="bullet"/>
+      <w:lvlText w:val="o"/>
+      <w:lvlJc w:val="left"/>
+      <w:pPr>
+        <w:ind w:left="1440" w:hanging="360"/>
+      </w:pPr>
+      <w:rPr>
+        <w:rFonts w:hint="default" w:ascii="Courier New" w:hAnsi="Courier New"/>
+      </w:rPr>
+    </w:lvl>
+    <w:lvl xmlns:w="http://schemas.openxmlformats.org/wordprocessingml/2006/main" w:ilvl="2">
+      <w:start w:val="1"/>
+      <w:numFmt w:val="bullet"/>
+      <w:lvlText w:val=""/>
+      <w:lvlJc w:val="left"/>
+      <w:pPr>
+        <w:ind w:left="2160" w:hanging="360"/>
+      </w:pPr>
+      <w:rPr>
+        <w:rFonts w:hint="default" w:ascii="Wingdings" w:hAnsi="Wingdings"/>
+      </w:rPr>
+    </w:lvl>
+    <w:lvl xmlns:w="http://schemas.openxmlformats.org/wordprocessingml/2006/main" w:ilvl="3">
+      <w:start w:val="1"/>
+      <w:numFmt w:val="bullet"/>
+      <w:lvlText w:val=""/>
+      <w:lvlJc w:val="left"/>
+      <w:pPr>
+        <w:ind w:left="2880" w:hanging="360"/>
+      </w:pPr>
+      <w:rPr>
+        <w:rFonts w:hint="default" w:ascii="Symbol" w:hAnsi="Symbol"/>
+      </w:rPr>
+    </w:lvl>
+    <w:lvl xmlns:w="http://schemas.openxmlformats.org/wordprocessingml/2006/main" w:ilvl="4">
+      <w:start w:val="1"/>
+      <w:numFmt w:val="bullet"/>
+      <w:lvlText w:val="o"/>
+      <w:lvlJc w:val="left"/>
+      <w:pPr>
+        <w:ind w:left="3600" w:hanging="360"/>
+      </w:pPr>
+      <w:rPr>
+        <w:rFonts w:hint="default" w:ascii="Courier New" w:hAnsi="Courier New"/>
+      </w:rPr>
+    </w:lvl>
+    <w:lvl xmlns:w="http://schemas.openxmlformats.org/wordprocessingml/2006/main" w:ilvl="5">
+      <w:start w:val="1"/>
+      <w:numFmt w:val="bullet"/>
+      <w:lvlText w:val=""/>
+      <w:lvlJc w:val="left"/>
+      <w:pPr>
+        <w:ind w:left="4320" w:hanging="360"/>
+      </w:pPr>
+      <w:rPr>
+        <w:rFonts w:hint="default" w:ascii="Wingdings" w:hAnsi="Wingdings"/>
+      </w:rPr>
+    </w:lvl>
+    <w:lvl xmlns:w="http://schemas.openxmlformats.org/wordprocessingml/2006/main" w:ilvl="6">
+      <w:start w:val="1"/>
+      <w:numFmt w:val="bullet"/>
+      <w:lvlText w:val=""/>
+      <w:lvlJc w:val="left"/>
+      <w:pPr>
+        <w:ind w:left="5040" w:hanging="360"/>
+      </w:pPr>
+      <w:rPr>
+        <w:rFonts w:hint="default" w:ascii="Symbol" w:hAnsi="Symbol"/>
+      </w:rPr>
+    </w:lvl>
+    <w:lvl xmlns:w="http://schemas.openxmlformats.org/wordprocessingml/2006/main" w:ilvl="7">
+      <w:start w:val="1"/>
+      <w:numFmt w:val="bullet"/>
+      <w:lvlText w:val="o"/>
+      <w:lvlJc w:val="left"/>
+      <w:pPr>
+        <w:ind w:left="5760" w:hanging="360"/>
+      </w:pPr>
+      <w:rPr>
+        <w:rFonts w:hint="default" w:ascii="Courier New" w:hAnsi="Courier New"/>
+      </w:rPr>
+    </w:lvl>
+    <w:lvl xmlns:w="http://schemas.openxmlformats.org/wordprocessingml/2006/main" w:ilvl="8">
+      <w:start w:val="1"/>
+      <w:numFmt w:val="bullet"/>
+      <w:lvlText w:val=""/>
+      <w:lvlJc w:val="left"/>
+      <w:pPr>
+        <w:ind w:left="6480" w:hanging="360"/>
+      </w:pPr>
+      <w:rPr>
+        <w:rFonts w:hint="default" w:ascii="Wingdings" w:hAnsi="Wingdings"/>
+      </w:rPr>
+    </w:lvl>
+  </w:abstractNum>
+  <w:abstractNum xmlns:w="http://schemas.openxmlformats.org/wordprocessingml/2006/main" w:abstractNumId="2">
+    <w:nsid w:val="650b65ad"/>
+    <w:multiLevelType xmlns:w="http://schemas.openxmlformats.org/wordprocessingml/2006/main" w:val="hybridMultilevel"/>
+    <w:lvl xmlns:w="http://schemas.openxmlformats.org/wordprocessingml/2006/main" w:ilvl="0">
+      <w:start w:val="1"/>
+      <w:numFmt w:val="bullet"/>
+      <w:lvlText w:val=""/>
+      <w:lvlJc w:val="left"/>
+      <w:pPr>
+        <w:ind w:left="720" w:hanging="360"/>
+      </w:pPr>
+      <w:rPr>
+        <w:rFonts w:hint="default" w:ascii="Symbol" w:hAnsi="Symbol"/>
+      </w:rPr>
+    </w:lvl>
+    <w:lvl xmlns:w="http://schemas.openxmlformats.org/wordprocessingml/2006/main" w:ilvl="1">
+      <w:start w:val="1"/>
+      <w:numFmt w:val="bullet"/>
+      <w:lvlText w:val="o"/>
+      <w:lvlJc w:val="left"/>
+      <w:pPr>
+        <w:ind w:left="1440" w:hanging="360"/>
+      </w:pPr>
+      <w:rPr>
+        <w:rFonts w:hint="default" w:ascii="Courier New" w:hAnsi="Courier New"/>
+      </w:rPr>
+    </w:lvl>
+    <w:lvl xmlns:w="http://schemas.openxmlformats.org/wordprocessingml/2006/main" w:ilvl="2">
+      <w:start w:val="1"/>
+      <w:numFmt w:val="bullet"/>
+      <w:lvlText w:val=""/>
+      <w:lvlJc w:val="left"/>
+      <w:pPr>
+        <w:ind w:left="2160" w:hanging="360"/>
+      </w:pPr>
+      <w:rPr>
+        <w:rFonts w:hint="default" w:ascii="Wingdings" w:hAnsi="Wingdings"/>
+      </w:rPr>
+    </w:lvl>
+    <w:lvl xmlns:w="http://schemas.openxmlformats.org/wordprocessingml/2006/main" w:ilvl="3">
+      <w:start w:val="1"/>
+      <w:numFmt w:val="bullet"/>
+      <w:lvlText w:val=""/>
+      <w:lvlJc w:val="left"/>
+      <w:pPr>
+        <w:ind w:left="2880" w:hanging="360"/>
+      </w:pPr>
+      <w:rPr>
+        <w:rFonts w:hint="default" w:ascii="Symbol" w:hAnsi="Symbol"/>
+      </w:rPr>
+    </w:lvl>
+    <w:lvl xmlns:w="http://schemas.openxmlformats.org/wordprocessingml/2006/main" w:ilvl="4">
+      <w:start w:val="1"/>
+      <w:numFmt w:val="bullet"/>
+      <w:lvlText w:val="o"/>
+      <w:lvlJc w:val="left"/>
+      <w:pPr>
+        <w:ind w:left="3600" w:hanging="360"/>
+      </w:pPr>
+      <w:rPr>
+        <w:rFonts w:hint="default" w:ascii="Courier New" w:hAnsi="Courier New"/>
+      </w:rPr>
+    </w:lvl>
+    <w:lvl xmlns:w="http://schemas.openxmlformats.org/wordprocessingml/2006/main" w:ilvl="5">
+      <w:start w:val="1"/>
+      <w:numFmt w:val="bullet"/>
+      <w:lvlText w:val=""/>
+      <w:lvlJc w:val="left"/>
+      <w:pPr>
+        <w:ind w:left="4320" w:hanging="360"/>
+      </w:pPr>
+      <w:rPr>
+        <w:rFonts w:hint="default" w:ascii="Wingdings" w:hAnsi="Wingdings"/>
+      </w:rPr>
+    </w:lvl>
+    <w:lvl xmlns:w="http://schemas.openxmlformats.org/wordprocessingml/2006/main" w:ilvl="6">
+      <w:start w:val="1"/>
+      <w:numFmt w:val="bullet"/>
+      <w:lvlText w:val=""/>
+      <w:lvlJc w:val="left"/>
+      <w:pPr>
+        <w:ind w:left="5040" w:hanging="360"/>
+      </w:pPr>
+      <w:rPr>
+        <w:rFonts w:hint="default" w:ascii="Symbol" w:hAnsi="Symbol"/>
+      </w:rPr>
+    </w:lvl>
+    <w:lvl xmlns:w="http://schemas.openxmlformats.org/wordprocessingml/2006/main" w:ilvl="7">
+      <w:start w:val="1"/>
+      <w:numFmt w:val="bullet"/>
+      <w:lvlText w:val="o"/>
+      <w:lvlJc w:val="left"/>
+      <w:pPr>
+        <w:ind w:left="5760" w:hanging="360"/>
+      </w:pPr>
+      <w:rPr>
+        <w:rFonts w:hint="default" w:ascii="Courier New" w:hAnsi="Courier New"/>
+      </w:rPr>
+    </w:lvl>
+    <w:lvl xmlns:w="http://schemas.openxmlformats.org/wordprocessingml/2006/main" w:ilvl="8">
+      <w:start w:val="1"/>
+      <w:numFmt w:val="bullet"/>
+      <w:lvlText w:val=""/>
+      <w:lvlJc w:val="left"/>
+      <w:pPr>
+        <w:ind w:left="6480" w:hanging="360"/>
+      </w:pPr>
+      <w:rPr>
+        <w:rFonts w:hint="default" w:ascii="Wingdings" w:hAnsi="Wingdings"/>
+      </w:rPr>
+    </w:lvl>
+  </w:abstractNum>
+  <w:abstractNum xmlns:w="http://schemas.openxmlformats.org/wordprocessingml/2006/main" w:abstractNumId="1">
+    <w:nsid w:val="6a63cf25"/>
+    <w:multiLevelType xmlns:w="http://schemas.openxmlformats.org/wordprocessingml/2006/main" w:val="hybridMultilevel"/>
+    <w:lvl xmlns:w="http://schemas.openxmlformats.org/wordprocessingml/2006/main" w:ilvl="0">
+      <w:start w:val="1"/>
+      <w:numFmt w:val="bullet"/>
+      <w:lvlText w:val=""/>
+      <w:lvlJc w:val="left"/>
+      <w:pPr>
+        <w:ind w:left="720" w:hanging="360"/>
+      </w:pPr>
+      <w:rPr>
+        <w:rFonts w:hint="default" w:ascii="Symbol" w:hAnsi="Symbol"/>
+      </w:rPr>
+    </w:lvl>
+    <w:lvl xmlns:w="http://schemas.openxmlformats.org/wordprocessingml/2006/main" w:ilvl="1">
+      <w:start w:val="1"/>
+      <w:numFmt w:val="bullet"/>
+      <w:lvlText w:val="o"/>
+      <w:lvlJc w:val="left"/>
+      <w:pPr>
+        <w:ind w:left="1440" w:hanging="360"/>
+      </w:pPr>
+      <w:rPr>
+        <w:rFonts w:hint="default" w:ascii="Courier New" w:hAnsi="Courier New"/>
+      </w:rPr>
+    </w:lvl>
+    <w:lvl xmlns:w="http://schemas.openxmlformats.org/wordprocessingml/2006/main" w:ilvl="2">
+      <w:start w:val="1"/>
+      <w:numFmt w:val="bullet"/>
+      <w:lvlText w:val=""/>
+      <w:lvlJc w:val="left"/>
+      <w:pPr>
+        <w:ind w:left="2160" w:hanging="360"/>
+      </w:pPr>
+      <w:rPr>
+        <w:rFonts w:hint="default" w:ascii="Wingdings" w:hAnsi="Wingdings"/>
+      </w:rPr>
+    </w:lvl>
+    <w:lvl xmlns:w="http://schemas.openxmlformats.org/wordprocessingml/2006/main" w:ilvl="3">
+      <w:start w:val="1"/>
+      <w:numFmt w:val="bullet"/>
+      <w:lvlText w:val=""/>
+      <w:lvlJc w:val="left"/>
+      <w:pPr>
+        <w:ind w:left="2880" w:hanging="360"/>
+      </w:pPr>
+      <w:rPr>
+        <w:rFonts w:hint="default" w:ascii="Symbol" w:hAnsi="Symbol"/>
+      </w:rPr>
+    </w:lvl>
+    <w:lvl xmlns:w="http://schemas.openxmlformats.org/wordprocessingml/2006/main" w:ilvl="4">
+      <w:start w:val="1"/>
+      <w:numFmt w:val="bullet"/>
+      <w:lvlText w:val="o"/>
+      <w:lvlJc w:val="left"/>
+      <w:pPr>
+        <w:ind w:left="3600" w:hanging="360"/>
+      </w:pPr>
+      <w:rPr>
+        <w:rFonts w:hint="default" w:ascii="Courier New" w:hAnsi="Courier New"/>
+      </w:rPr>
+    </w:lvl>
+    <w:lvl xmlns:w="http://schemas.openxmlformats.org/wordprocessingml/2006/main" w:ilvl="5">
+      <w:start w:val="1"/>
+      <w:numFmt w:val="bullet"/>
+      <w:lvlText w:val=""/>
+      <w:lvlJc w:val="left"/>
+      <w:pPr>
+        <w:ind w:left="4320" w:hanging="360"/>
+      </w:pPr>
+      <w:rPr>
+        <w:rFonts w:hint="default" w:ascii="Wingdings" w:hAnsi="Wingdings"/>
+      </w:rPr>
+    </w:lvl>
+    <w:lvl xmlns:w="http://schemas.openxmlformats.org/wordprocessingml/2006/main" w:ilvl="6">
+      <w:start w:val="1"/>
+      <w:numFmt w:val="bullet"/>
+      <w:lvlText w:val=""/>
+      <w:lvlJc w:val="left"/>
+      <w:pPr>
+        <w:ind w:left="5040" w:hanging="360"/>
+      </w:pPr>
+      <w:rPr>
+        <w:rFonts w:hint="default" w:ascii="Symbol" w:hAnsi="Symbol"/>
+      </w:rPr>
+    </w:lvl>
+    <w:lvl xmlns:w="http://schemas.openxmlformats.org/wordprocessingml/2006/main" w:ilvl="7">
+      <w:start w:val="1"/>
+      <w:numFmt w:val="bullet"/>
+      <w:lvlText w:val="o"/>
+      <w:lvlJc w:val="left"/>
+      <w:pPr>
+        <w:ind w:left="5760" w:hanging="360"/>
+      </w:pPr>
+      <w:rPr>
+        <w:rFonts w:hint="default" w:ascii="Courier New" w:hAnsi="Courier New"/>
+      </w:rPr>
+    </w:lvl>
+    <w:lvl xmlns:w="http://schemas.openxmlformats.org/wordprocessingml/2006/main" w:ilvl="8">
+      <w:start w:val="1"/>
+      <w:numFmt w:val="bullet"/>
+      <w:lvlText w:val=""/>
+      <w:lvlJc w:val="left"/>
+      <w:pPr>
+        <w:ind w:left="6480" w:hanging="360"/>
+      </w:pPr>
+      <w:rPr>
+        <w:rFonts w:hint="default" w:ascii="Wingdings" w:hAnsi="Wingdings"/>
+      </w:rPr>
+    </w:lvl>
+  </w:abstractNum>
+  <w:num w:numId="7">
+    <w:abstractNumId w:val="7"/>
+  </w:num>
+  <w:num w:numId="6">
+    <w:abstractNumId w:val="6"/>
+  </w:num>
+  <w:num w:numId="5">
+    <w:abstractNumId w:val="5"/>
+  </w:num>
+  <w:num w:numId="4">
+    <w:abstractNumId w:val="4"/>
+  </w:num>
+  <w:num w:numId="3">
+    <w:abstractNumId w:val="3"/>
+  </w:num>
+  <w:num w:numId="2">
+    <w:abstractNumId w:val="2"/>
+  </w:num>
+  <w:num w:numId="1">
+    <w:abstractNumId w:val="1"/>
+  </w:num>
+</w:numbering>
 </file>
 
 <file path=word/styles.xml><?xml version="1.0" encoding="utf-8"?>
@@ -5119,6 +6829,39 @@
       <w:lang w:val="sv-SE" w:eastAsia="sv-SE" w:bidi="ar-SA"/>
     </w:rPr>
   </w:style>
+  <w:style w:type="paragraph" w:styleId="Heading2">
+    <w:uiPriority w:val="9"/>
+    <w:name w:val="heading 2"/>
+    <w:basedOn w:val="Normal"/>
+    <w:next w:val="Normal"/>
+    <w:unhideWhenUsed/>
+    <w:qFormat/>
+    <w:rsid w:val="54E9BA47"/>
+    <w:rPr>
+      <w:rFonts w:ascii="Calibri Light" w:hAnsi="Calibri Light" w:eastAsia="游ゴシック Light" w:cs="Times New Roman" w:asciiTheme="majorAscii" w:hAnsiTheme="majorAscii" w:eastAsiaTheme="majorEastAsia" w:cstheme="majorBidi"/>
+      <w:color w:val="2F5496" w:themeColor="accent1" w:themeTint="FF" w:themeShade="BF"/>
+      <w:sz w:val="32"/>
+      <w:szCs w:val="32"/>
+    </w:rPr>
+    <w:pPr>
+      <w:keepNext w:val="1"/>
+      <w:keepLines w:val="1"/>
+      <w:spacing w:before="160" w:after="80"/>
+      <w:outlineLvl w:val="1"/>
+    </w:pPr>
+  </w:style>
+  <w:style w:type="paragraph" w:styleId="ListParagraph">
+    <w:uiPriority w:val="34"/>
+    <w:name w:val="List Paragraph"/>
+    <w:basedOn w:val="Normal"/>
+    <w:qFormat/>
+    <w:rsid w:val="54E9BA47"/>
+    <w:pPr>
+      <w:spacing/>
+      <w:ind w:left="720"/>
+      <w:contextualSpacing/>
+    </w:pPr>
+  </w:style>
 </w:styles>
 </file>
 

</xml_diff>